<commit_message>
Ajoute Ghobech Ali au tableau d'encadrement et corrige la surface de référence
Ajoute la ligne Ghobech Ali (Interlocuteur Unique) au tableau
"Encadrement affecté à l'opération" (§3.2) et corrige la surface des
travaux de peinture et sols dirigés par Zaka Ullah Butt (50 000 m²).

Co-Authored-By: Claude Sonnet 5 <noreply@anthropic.com>
Claude-Session: https://claude.ai/code/session_016J8ZBxzUkBqS3C16QP9P63
</commit_message>
<xml_diff>
--- a/livrables/Lot3_Chapitre3_MoyensHumainsMateriels.docx
+++ b/livrables/Lot3_Chapitre3_MoyensHumainsMateriels.docx
@@ -579,6 +579,49 @@
               <w:rPr>
                 <w:sz w:val="18"/>
               </w:rPr>
+              <w:t>Ghobech Ali</w:t>
+            </w:r>
+          </w:p>
+        </w:tc>
+        <w:tc>
+          <w:tcPr>
+            <w:tcW w:type="dxa" w:w="2835"/>
+          </w:tcPr>
+          <w:p>
+            <w:r/>
+            <w:r>
+              <w:rPr>
+                <w:sz w:val="18"/>
+              </w:rPr>
+              <w:t>Interlocuteur Unique</w:t>
+            </w:r>
+          </w:p>
+        </w:tc>
+        <w:tc>
+          <w:tcPr>
+            <w:tcW w:type="dxa" w:w="4252"/>
+          </w:tcPr>
+          <w:p>
+            <w:r/>
+            <w:r>
+              <w:rPr>
+                <w:sz w:val="18"/>
+              </w:rPr>
+            </w:r>
+          </w:p>
+        </w:tc>
+      </w:tr>
+      <w:tr>
+        <w:tc>
+          <w:tcPr>
+            <w:tcW w:type="dxa" w:w="1701"/>
+          </w:tcPr>
+          <w:p>
+            <w:r/>
+            <w:r>
+              <w:rPr>
+                <w:sz w:val="18"/>
+              </w:rPr>
               <w:t>Zaka Ullah Butt</w:t>
             </w:r>
           </w:p>
@@ -607,7 +650,7 @@
               <w:rPr>
                 <w:sz w:val="18"/>
               </w:rPr>
-              <w:t>15 ans d'expérience en pilotage de chantiers second œuvre (scolaire, hospitalier, tertiaire). Certifié Amiante Sous-section 4 (SS4) — Encadrant Technique. Chez France Décoration depuis 2022, où il a dirigé des travaux de peinture et sols de 5 000 m² en milieu hospitalier (validation des supports, gestion des risques plomb, coordination HSE, animation des quarts d'heure sécurité, pilotage des OPR/OPL).</w:t>
+              <w:t>15 ans d'expérience en pilotage de chantiers second œuvre (scolaire, hospitalier, tertiaire). Certifié Amiante Sous-section 4 (SS4) — Encadrant Technique. Chez France Décoration depuis 2022, où il a dirigé des travaux de peinture et sols de 50 000 m² en milieu hospitalier (validation des supports, gestion des risques plomb, coordination HSE, animation des quarts d'heure sécurité, pilotage des OPR/OPL).</w:t>
             </w:r>
           </w:p>
         </w:tc>
@@ -1425,7 +1468,7 @@
               <w:rPr>
                 <w:sz w:val="18"/>
               </w:rPr>
-              <w:t>Direction des travaux de peinture et sols (5 000 m²) en milieu hospitalier chez France Décoration (2022-aujourd'hui) : validation des supports, gestion des risques plomb, coordination des OPR/OPL</w:t>
+              <w:t>Direction des travaux de peinture et sols (50 000 m²) en milieu hospitalier chez France Décoration (2022-aujourd'hui) : validation des supports, gestion des risques plomb, coordination des OPR/OPL</w:t>
             </w:r>
           </w:p>
         </w:tc>

</xml_diff>

<commit_message>
Reconstruit les références (§3.5) à partir de l'annexe Référence Chantier et localise les 4 dépôts (§3.6)
§3.5 : remplace le placeholder par les vraies références France
Décoration (Annexe 9), en tête desquelles deux opérations déjà
réalisées pour l'AP-HP, le marché d'entretien pluriannuel du CH de
Pontoise (+700 000€) et une dizaine d'autres chantiers hospitaliers
significatifs (Bichat, Foch, Novo, Institut Curie...).

§3.6 : remplace les 4 locaux de stockage génériques par les 4 dépôts
réels de France Décoration : Livry-Gargan, La Houssaye-en-Brie
(siège social), Saint-Ouen et Paris.

Co-Authored-By: Claude Sonnet 5 <noreply@anthropic.com>
Claude-Session: https://claude.ai/code/session_016J8ZBxzUkBqS3C16QP9P63
</commit_message>
<xml_diff>
--- a/livrables/Lot3_Chapitre3_MoyensHumainsMateriels.docx
+++ b/livrables/Lot3_Chapitre3_MoyensHumainsMateriels.docx
@@ -1393,7 +1393,696 @@
           <w:i w:val="0"/>
           <w:sz w:val="21"/>
         </w:rPr>
-        <w:t>L'équipe affectée au Lot 3 réunit une expérience cumulée significative en établissements hospitaliers et ERP occupés, acquise tant au sein de France Décoration que chez de précédents employeurs, avant leur intégration à notre société.</w:t>
+        <w:t>France Décoration justifie d'une expérience approfondie et continue en établissements hospitaliers occupés, avec plus de trente opérations de faux plafonds, peinture et revêtements de sols réalisées depuis 2022 pour des centres hospitaliers, cliniques et EHPAD, dont deux opérations déjà conduites pour l'AP-HP elle-même. Cette expérience est directement transposable aux exigences du Lot 3 : phasage en site occupé, coordination multi-lots, hygiène renforcée et gestion des zones sensibles (stérilisation, radiologie, blocs).</w:t>
+      </w:r>
+    </w:p>
+    <w:tbl>
+      <w:tblPr>
+        <w:tblStyle w:val="TableGrid"/>
+        <w:tblW w:type="auto" w:w="0"/>
+        <w:jc w:val="center"/>
+        <w:tblLook w:firstColumn="1" w:firstRow="1" w:lastColumn="0" w:lastRow="0" w:noHBand="0" w:noVBand="1" w:val="04A0"/>
+      </w:tblPr>
+      <w:tblGrid>
+        <w:gridCol w:w="2550"/>
+        <w:gridCol w:w="2550"/>
+        <w:gridCol w:w="2550"/>
+        <w:gridCol w:w="2550"/>
+      </w:tblGrid>
+      <w:tr>
+        <w:tc>
+          <w:tcPr>
+            <w:tcW w:type="dxa" w:w="1304"/>
+            <w:shd w:val="clear" w:color="auto" w:fill="2E74B5"/>
+          </w:tcPr>
+          <w:p>
+            <w:r/>
+            <w:r>
+              <w:rPr>
+                <w:b/>
+                <w:color w:val="FFFFFF"/>
+                <w:sz w:val="18"/>
+              </w:rPr>
+              <w:t>Année</w:t>
+            </w:r>
+          </w:p>
+        </w:tc>
+        <w:tc>
+          <w:tcPr>
+            <w:tcW w:type="dxa" w:w="2835"/>
+            <w:shd w:val="clear" w:color="auto" w:fill="2E74B5"/>
+          </w:tcPr>
+          <w:p>
+            <w:r/>
+            <w:r>
+              <w:rPr>
+                <w:b/>
+                <w:color w:val="FFFFFF"/>
+                <w:sz w:val="18"/>
+              </w:rPr>
+              <w:t>Client</w:t>
+            </w:r>
+          </w:p>
+        </w:tc>
+        <w:tc>
+          <w:tcPr>
+            <w:tcW w:type="dxa" w:w="3798"/>
+            <w:shd w:val="clear" w:color="auto" w:fill="2E74B5"/>
+          </w:tcPr>
+          <w:p>
+            <w:r/>
+            <w:r>
+              <w:rPr>
+                <w:b/>
+                <w:color w:val="FFFFFF"/>
+                <w:sz w:val="18"/>
+              </w:rPr>
+              <w:t>Nature des travaux</w:t>
+            </w:r>
+          </w:p>
+        </w:tc>
+        <w:tc>
+          <w:tcPr>
+            <w:tcW w:type="dxa" w:w="1417"/>
+            <w:shd w:val="clear" w:color="auto" w:fill="2E74B5"/>
+          </w:tcPr>
+          <w:p>
+            <w:r/>
+            <w:r>
+              <w:rPr>
+                <w:b/>
+                <w:color w:val="FFFFFF"/>
+                <w:sz w:val="18"/>
+              </w:rPr>
+              <w:t>Montant HT</w:t>
+            </w:r>
+          </w:p>
+        </w:tc>
+      </w:tr>
+      <w:tr>
+        <w:tc>
+          <w:tcPr>
+            <w:tcW w:type="dxa" w:w="1304"/>
+          </w:tcPr>
+          <w:p>
+            <w:r/>
+            <w:r>
+              <w:rPr>
+                <w:sz w:val="18"/>
+              </w:rPr>
+              <w:t>2025 / 2026</w:t>
+            </w:r>
+          </w:p>
+        </w:tc>
+        <w:tc>
+          <w:tcPr>
+            <w:tcW w:type="dxa" w:w="2835"/>
+          </w:tcPr>
+          <w:p>
+            <w:r/>
+            <w:r>
+              <w:rPr>
+                <w:sz w:val="18"/>
+              </w:rPr>
+              <w:t>AP-HP — Assistance Publique - Hôpitaux de Paris</w:t>
+            </w:r>
+          </w:p>
+        </w:tc>
+        <w:tc>
+          <w:tcPr>
+            <w:tcW w:type="dxa" w:w="3798"/>
+          </w:tcPr>
+          <w:p>
+            <w:r/>
+            <w:r>
+              <w:rPr>
+                <w:sz w:val="18"/>
+              </w:rPr>
+              <w:t>Travaux de peintures et sols souples ; puis restructuration du bâtiment ADY STEG (antenne IFSI) — Lot revêtements sol et murs / peintures / signalétique / nettoyage</w:t>
+            </w:r>
+          </w:p>
+        </w:tc>
+        <w:tc>
+          <w:tcPr>
+            <w:tcW w:type="dxa" w:w="1417"/>
+          </w:tcPr>
+          <w:p>
+            <w:r/>
+            <w:r>
+              <w:rPr>
+                <w:sz w:val="18"/>
+              </w:rPr>
+              <w:t>99 798,68 € + 95 887,20 €</w:t>
+            </w:r>
+          </w:p>
+        </w:tc>
+      </w:tr>
+      <w:tr>
+        <w:tc>
+          <w:tcPr>
+            <w:tcW w:type="dxa" w:w="1304"/>
+          </w:tcPr>
+          <w:p>
+            <w:r/>
+            <w:r>
+              <w:rPr>
+                <w:sz w:val="18"/>
+              </w:rPr>
+              <w:t>2022-2026</w:t>
+            </w:r>
+          </w:p>
+        </w:tc>
+        <w:tc>
+          <w:tcPr>
+            <w:tcW w:type="dxa" w:w="2835"/>
+          </w:tcPr>
+          <w:p>
+            <w:r/>
+            <w:r>
+              <w:rPr>
+                <w:sz w:val="18"/>
+              </w:rPr>
+              <w:t>Centre Hospitalier de Pontoise</w:t>
+            </w:r>
+          </w:p>
+        </w:tc>
+        <w:tc>
+          <w:tcPr>
+            <w:tcW w:type="dxa" w:w="3798"/>
+          </w:tcPr>
+          <w:p>
+            <w:r/>
+            <w:r>
+              <w:rPr>
+                <w:sz w:val="18"/>
+              </w:rPr>
+              <w:t>Marché d'entretien pluriannuel — travaux de peinture, revêtements de sols et muraux</w:t>
+            </w:r>
+          </w:p>
+        </w:tc>
+        <w:tc>
+          <w:tcPr>
+            <w:tcW w:type="dxa" w:w="1417"/>
+          </w:tcPr>
+          <w:p>
+            <w:r/>
+            <w:r>
+              <w:rPr>
+                <w:sz w:val="18"/>
+              </w:rPr>
+              <w:t>+ 700 000 €</w:t>
+            </w:r>
+          </w:p>
+        </w:tc>
+      </w:tr>
+      <w:tr>
+        <w:tc>
+          <w:tcPr>
+            <w:tcW w:type="dxa" w:w="1304"/>
+          </w:tcPr>
+          <w:p>
+            <w:r/>
+            <w:r>
+              <w:rPr>
+                <w:sz w:val="18"/>
+              </w:rPr>
+              <w:t>2023</w:t>
+            </w:r>
+          </w:p>
+        </w:tc>
+        <w:tc>
+          <w:tcPr>
+            <w:tcW w:type="dxa" w:w="2835"/>
+          </w:tcPr>
+          <w:p>
+            <w:r/>
+            <w:r>
+              <w:rPr>
+                <w:sz w:val="18"/>
+              </w:rPr>
+              <w:t>Centre Hospitalier René Dubos Pontoise</w:t>
+            </w:r>
+          </w:p>
+        </w:tc>
+        <w:tc>
+          <w:tcPr>
+            <w:tcW w:type="dxa" w:w="3798"/>
+          </w:tcPr>
+          <w:p>
+            <w:r/>
+            <w:r>
+              <w:rPr>
+                <w:sz w:val="18"/>
+              </w:rPr>
+              <w:t>Psychiatrie Jean Delay — faux plafonds, peintures, sols</w:t>
+            </w:r>
+          </w:p>
+        </w:tc>
+        <w:tc>
+          <w:tcPr>
+            <w:tcW w:type="dxa" w:w="1417"/>
+          </w:tcPr>
+          <w:p>
+            <w:r/>
+            <w:r>
+              <w:rPr>
+                <w:sz w:val="18"/>
+              </w:rPr>
+              <w:t>1 054 684,99 €</w:t>
+            </w:r>
+          </w:p>
+        </w:tc>
+      </w:tr>
+      <w:tr>
+        <w:tc>
+          <w:tcPr>
+            <w:tcW w:type="dxa" w:w="1304"/>
+          </w:tcPr>
+          <w:p>
+            <w:r/>
+            <w:r>
+              <w:rPr>
+                <w:sz w:val="18"/>
+              </w:rPr>
+              <w:t>2025</w:t>
+            </w:r>
+          </w:p>
+        </w:tc>
+        <w:tc>
+          <w:tcPr>
+            <w:tcW w:type="dxa" w:w="2835"/>
+          </w:tcPr>
+          <w:p>
+            <w:r/>
+            <w:r>
+              <w:rPr>
+                <w:sz w:val="18"/>
+              </w:rPr>
+              <w:t>Centre Hospitalier René Dubos</w:t>
+            </w:r>
+          </w:p>
+        </w:tc>
+        <w:tc>
+          <w:tcPr>
+            <w:tcW w:type="dxa" w:w="3798"/>
+          </w:tcPr>
+          <w:p>
+            <w:r/>
+            <w:r>
+              <w:rPr>
+                <w:sz w:val="18"/>
+              </w:rPr>
+              <w:t>Schéma Directeur Incendie (SDSI), bâtiment BMC — restructuration tour R+2 à R+6, finitions sols/plafonds/murs</w:t>
+            </w:r>
+          </w:p>
+        </w:tc>
+        <w:tc>
+          <w:tcPr>
+            <w:tcW w:type="dxa" w:w="1417"/>
+          </w:tcPr>
+          <w:p>
+            <w:r/>
+            <w:r>
+              <w:rPr>
+                <w:sz w:val="18"/>
+              </w:rPr>
+              <w:t>796 424 €</w:t>
+            </w:r>
+          </w:p>
+        </w:tc>
+      </w:tr>
+      <w:tr>
+        <w:tc>
+          <w:tcPr>
+            <w:tcW w:type="dxa" w:w="1304"/>
+          </w:tcPr>
+          <w:p>
+            <w:r/>
+            <w:r>
+              <w:rPr>
+                <w:sz w:val="18"/>
+              </w:rPr>
+              <w:t>2026</w:t>
+            </w:r>
+          </w:p>
+        </w:tc>
+        <w:tc>
+          <w:tcPr>
+            <w:tcW w:type="dxa" w:w="2835"/>
+          </w:tcPr>
+          <w:p>
+            <w:r/>
+            <w:r>
+              <w:rPr>
+                <w:sz w:val="18"/>
+              </w:rPr>
+              <w:t>Centre Hospitalier du Sud Seine-et-Marne (EHPAD Fontainebleau)</w:t>
+            </w:r>
+          </w:p>
+        </w:tc>
+        <w:tc>
+          <w:tcPr>
+            <w:tcW w:type="dxa" w:w="3798"/>
+          </w:tcPr>
+          <w:p>
+            <w:r/>
+            <w:r>
+              <w:rPr>
+                <w:sz w:val="18"/>
+              </w:rPr>
+              <w:t>Rénovation partielle — Lot 05 revêtements sols et murs, faux plafonds, peinture</w:t>
+            </w:r>
+          </w:p>
+        </w:tc>
+        <w:tc>
+          <w:tcPr>
+            <w:tcW w:type="dxa" w:w="1417"/>
+          </w:tcPr>
+          <w:p>
+            <w:r/>
+            <w:r>
+              <w:rPr>
+                <w:sz w:val="18"/>
+              </w:rPr>
+              <w:t>698 210,76 €</w:t>
+            </w:r>
+          </w:p>
+        </w:tc>
+      </w:tr>
+      <w:tr>
+        <w:tc>
+          <w:tcPr>
+            <w:tcW w:type="dxa" w:w="1304"/>
+          </w:tcPr>
+          <w:p>
+            <w:r/>
+            <w:r>
+              <w:rPr>
+                <w:sz w:val="18"/>
+              </w:rPr>
+              <w:t>2022</w:t>
+            </w:r>
+          </w:p>
+        </w:tc>
+        <w:tc>
+          <w:tcPr>
+            <w:tcW w:type="dxa" w:w="2835"/>
+          </w:tcPr>
+          <w:p>
+            <w:r/>
+            <w:r>
+              <w:rPr>
+                <w:sz w:val="18"/>
+              </w:rPr>
+              <w:t>Hôpital Bichat</w:t>
+            </w:r>
+          </w:p>
+        </w:tc>
+        <w:tc>
+          <w:tcPr>
+            <w:tcW w:type="dxa" w:w="3798"/>
+          </w:tcPr>
+          <w:p>
+            <w:r/>
+            <w:r>
+              <w:rPr>
+                <w:sz w:val="18"/>
+              </w:rPr>
+              <w:t>Réhabilitation plateforme d'exploration fonctionnelle Inserm U1148 — faux plafonds / sols / peinture</w:t>
+            </w:r>
+          </w:p>
+        </w:tc>
+        <w:tc>
+          <w:tcPr>
+            <w:tcW w:type="dxa" w:w="1417"/>
+          </w:tcPr>
+          <w:p>
+            <w:r/>
+            <w:r>
+              <w:rPr>
+                <w:sz w:val="18"/>
+              </w:rPr>
+              <w:t>67 931,35 €</w:t>
+            </w:r>
+          </w:p>
+        </w:tc>
+      </w:tr>
+      <w:tr>
+        <w:tc>
+          <w:tcPr>
+            <w:tcW w:type="dxa" w:w="1304"/>
+          </w:tcPr>
+          <w:p>
+            <w:r/>
+            <w:r>
+              <w:rPr>
+                <w:sz w:val="18"/>
+              </w:rPr>
+              <w:t>2022</w:t>
+            </w:r>
+          </w:p>
+        </w:tc>
+        <w:tc>
+          <w:tcPr>
+            <w:tcW w:type="dxa" w:w="2835"/>
+          </w:tcPr>
+          <w:p>
+            <w:r/>
+            <w:r>
+              <w:rPr>
+                <w:sz w:val="18"/>
+              </w:rPr>
+              <w:t>Clinique des Charmilles (Arpajon)</w:t>
+            </w:r>
+          </w:p>
+        </w:tc>
+        <w:tc>
+          <w:tcPr>
+            <w:tcW w:type="dxa" w:w="3798"/>
+          </w:tcPr>
+          <w:p>
+            <w:r/>
+            <w:r>
+              <w:rPr>
+                <w:sz w:val="18"/>
+              </w:rPr>
+              <w:t>Stérilisation — faux plafonds / peinture intérieure / sols souples / plâtrerie</w:t>
+            </w:r>
+          </w:p>
+        </w:tc>
+        <w:tc>
+          <w:tcPr>
+            <w:tcW w:type="dxa" w:w="1417"/>
+          </w:tcPr>
+          <w:p>
+            <w:r/>
+            <w:r>
+              <w:rPr>
+                <w:sz w:val="18"/>
+              </w:rPr>
+              <w:t>73 016 €</w:t>
+            </w:r>
+          </w:p>
+        </w:tc>
+      </w:tr>
+      <w:tr>
+        <w:tc>
+          <w:tcPr>
+            <w:tcW w:type="dxa" w:w="1304"/>
+          </w:tcPr>
+          <w:p>
+            <w:r/>
+            <w:r>
+              <w:rPr>
+                <w:sz w:val="18"/>
+              </w:rPr>
+              <w:t>2024</w:t>
+            </w:r>
+          </w:p>
+        </w:tc>
+        <w:tc>
+          <w:tcPr>
+            <w:tcW w:type="dxa" w:w="2835"/>
+          </w:tcPr>
+          <w:p>
+            <w:r/>
+            <w:r>
+              <w:rPr>
+                <w:sz w:val="18"/>
+              </w:rPr>
+              <w:t>Hôpital Foch</w:t>
+            </w:r>
+          </w:p>
+        </w:tc>
+        <w:tc>
+          <w:tcPr>
+            <w:tcW w:type="dxa" w:w="3798"/>
+          </w:tcPr>
+          <w:p>
+            <w:r/>
+            <w:r>
+              <w:rPr>
+                <w:sz w:val="18"/>
+              </w:rPr>
+              <w:t>Développement des activités ambulatoires (UCA – Endoscopies – SSPI)</w:t>
+            </w:r>
+          </w:p>
+        </w:tc>
+        <w:tc>
+          <w:tcPr>
+            <w:tcW w:type="dxa" w:w="1417"/>
+          </w:tcPr>
+          <w:p>
+            <w:r/>
+            <w:r>
+              <w:rPr>
+                <w:sz w:val="18"/>
+              </w:rPr>
+              <w:t>204 154,68 €</w:t>
+            </w:r>
+          </w:p>
+        </w:tc>
+      </w:tr>
+      <w:tr>
+        <w:tc>
+          <w:tcPr>
+            <w:tcW w:type="dxa" w:w="1304"/>
+          </w:tcPr>
+          <w:p>
+            <w:r/>
+            <w:r>
+              <w:rPr>
+                <w:sz w:val="18"/>
+              </w:rPr>
+              <w:t>2025</w:t>
+            </w:r>
+          </w:p>
+        </w:tc>
+        <w:tc>
+          <w:tcPr>
+            <w:tcW w:type="dxa" w:w="2835"/>
+          </w:tcPr>
+          <w:p>
+            <w:r/>
+            <w:r>
+              <w:rPr>
+                <w:sz w:val="18"/>
+              </w:rPr>
+              <w:t>Hôpital Novo</w:t>
+            </w:r>
+          </w:p>
+        </w:tc>
+        <w:tc>
+          <w:tcPr>
+            <w:tcW w:type="dxa" w:w="3798"/>
+          </w:tcPr>
+          <w:p>
+            <w:r/>
+            <w:r>
+              <w:rPr>
+                <w:sz w:val="18"/>
+              </w:rPr>
+              <w:t>Revêtement de sol souple, faux plafonds et peintures</w:t>
+            </w:r>
+          </w:p>
+        </w:tc>
+        <w:tc>
+          <w:tcPr>
+            <w:tcW w:type="dxa" w:w="1417"/>
+          </w:tcPr>
+          <w:p>
+            <w:r/>
+            <w:r>
+              <w:rPr>
+                <w:sz w:val="18"/>
+              </w:rPr>
+              <w:t>466 534,69 €</w:t>
+            </w:r>
+          </w:p>
+        </w:tc>
+      </w:tr>
+      <w:tr>
+        <w:tc>
+          <w:tcPr>
+            <w:tcW w:type="dxa" w:w="1304"/>
+          </w:tcPr>
+          <w:p>
+            <w:r/>
+            <w:r>
+              <w:rPr>
+                <w:sz w:val="18"/>
+              </w:rPr>
+              <w:t>2026</w:t>
+            </w:r>
+          </w:p>
+        </w:tc>
+        <w:tc>
+          <w:tcPr>
+            <w:tcW w:type="dxa" w:w="2835"/>
+          </w:tcPr>
+          <w:p>
+            <w:r/>
+            <w:r>
+              <w:rPr>
+                <w:sz w:val="18"/>
+              </w:rPr>
+              <w:t>Institut Curie</w:t>
+            </w:r>
+          </w:p>
+        </w:tc>
+        <w:tc>
+          <w:tcPr>
+            <w:tcW w:type="dxa" w:w="3798"/>
+          </w:tcPr>
+          <w:p>
+            <w:r/>
+            <w:r>
+              <w:rPr>
+                <w:sz w:val="18"/>
+              </w:rPr>
+              <w:t>Rénovation globale — Lot revêtements de sols</w:t>
+            </w:r>
+          </w:p>
+        </w:tc>
+        <w:tc>
+          <w:tcPr>
+            <w:tcW w:type="dxa" w:w="1417"/>
+          </w:tcPr>
+          <w:p>
+            <w:r/>
+            <w:r>
+              <w:rPr>
+                <w:sz w:val="18"/>
+              </w:rPr>
+              <w:t>318 477,92 €</w:t>
+            </w:r>
+          </w:p>
+        </w:tc>
+      </w:tr>
+    </w:tbl>
+    <w:p/>
+    <w:p>
+      <w:r>
+        <w:rPr>
+          <w:b w:val="0"/>
+          <w:i/>
+          <w:sz w:val="21"/>
+        </w:rPr>
+        <w:t>La liste complète des chantiers de référence (Annexe 9 — Référence Chantier) est jointe au dossier de candidature, ainsi que les attestations de bonne exécution correspondantes, conformément aux pièces demandées par le Règlement de la Consultation.</w:t>
+      </w:r>
+    </w:p>
+    <w:p>
+      <w:pPr>
+        <w:spacing w:before="160" w:after="60"/>
+      </w:pPr>
+      <w:r>
+        <w:rPr>
+          <w:b/>
+          <w:i/>
+          <w:color w:val="2E74B5"/>
+          <w:sz w:val="21"/>
+        </w:rPr>
+        <w:t>Expérience nominative des intervenants affectés au Lot 3</w:t>
       </w:r>
     </w:p>
     <w:tbl>
@@ -1427,7 +2116,7 @@
         </w:tc>
         <w:tc>
           <w:tcPr>
-            <w:tcW w:type="dxa" w:w="5953"/>
+            <w:tcW w:type="dxa" w:w="6520"/>
             <w:shd w:val="clear" w:color="auto" w:fill="2E74B5"/>
           </w:tcPr>
           <w:p>
@@ -1460,7 +2149,7 @@
         </w:tc>
         <w:tc>
           <w:tcPr>
-            <w:tcW w:type="dxa" w:w="5953"/>
+            <w:tcW w:type="dxa" w:w="6520"/>
           </w:tcPr>
           <w:p>
             <w:r/>
@@ -1490,7 +2179,7 @@
         </w:tc>
         <w:tc>
           <w:tcPr>
-            <w:tcW w:type="dxa" w:w="5953"/>
+            <w:tcW w:type="dxa" w:w="6520"/>
           </w:tcPr>
           <w:p>
             <w:r/>
@@ -1520,7 +2209,7 @@
         </w:tc>
         <w:tc>
           <w:tcPr>
-            <w:tcW w:type="dxa" w:w="5953"/>
+            <w:tcW w:type="dxa" w:w="6520"/>
           </w:tcPr>
           <w:p>
             <w:r/>
@@ -1550,7 +2239,7 @@
         </w:tc>
         <w:tc>
           <w:tcPr>
-            <w:tcW w:type="dxa" w:w="5953"/>
+            <w:tcW w:type="dxa" w:w="6520"/>
           </w:tcPr>
           <w:p>
             <w:r/>
@@ -1580,7 +2269,7 @@
         </w:tc>
         <w:tc>
           <w:tcPr>
-            <w:tcW w:type="dxa" w:w="5953"/>
+            <w:tcW w:type="dxa" w:w="6520"/>
           </w:tcPr>
           <w:p>
             <w:r/>
@@ -1610,7 +2299,7 @@
         </w:tc>
         <w:tc>
           <w:tcPr>
-            <w:tcW w:type="dxa" w:w="5953"/>
+            <w:tcW w:type="dxa" w:w="6520"/>
           </w:tcPr>
           <w:p>
             <w:r/>
@@ -1625,16 +2314,6 @@
       </w:tr>
     </w:tbl>
     <w:p/>
-    <w:p>
-      <w:r>
-        <w:rPr>
-          <w:b w:val="0"/>
-          <w:i/>
-          <w:sz w:val="21"/>
-        </w:rPr>
-        <w:t>Ces éléments, ainsi que les attestations de bonne exécution correspondantes, sont joints au dossier de candidature conformément aux pièces demandées par le Règlement de la Consultation.</w:t>
-      </w:r>
-    </w:p>
     <w:p>
       <w:r>
         <w:br w:type="page"/>
@@ -1913,7 +2592,7 @@
           <w:i w:val="0"/>
           <w:sz w:val="21"/>
         </w:rPr>
-        <w:t>Afin d'assurer des approvisionnements séquencés au plus près de chaque phase et de limiter le stockage prolongé de produits sensibles en site hospitalier occupé, France Décoration met en place quatre locaux de stockage distincts sur la durée du chantier, sous la responsabilité du Chef de Chantier (organisation des commandes, livraisons et zones de stockage — cf. § 3.2) :</w:t>
+        <w:t>France Décoration s'appuie sur son maillage de quatre dépôts en Île-de-France pour assurer des approvisionnements séquencés au plus près de chaque phase de chantier et limiter le stockage prolongé de produits sensibles en site hospitalier occupé. La répartition et l'expédition des matériels vers le chantier de l'hôpital René Muret sont organisées par le Chef de Chantier (organisation des commandes, livraisons et zones de stockage — cf. § 3.2) :</w:t>
       </w:r>
     </w:p>
     <w:tbl>
@@ -1931,7 +2610,7 @@
       <w:tr>
         <w:tc>
           <w:tcPr>
-            <w:tcW w:type="dxa" w:w="2835"/>
+            <w:tcW w:type="dxa" w:w="1417"/>
             <w:shd w:val="clear" w:color="auto" w:fill="2E74B5"/>
           </w:tcPr>
           <w:p>
@@ -1948,7 +2627,7 @@
         </w:tc>
         <w:tc>
           <w:tcPr>
-            <w:tcW w:type="dxa" w:w="3402"/>
+            <w:tcW w:type="dxa" w:w="2551"/>
             <w:shd w:val="clear" w:color="auto" w:fill="2E74B5"/>
           </w:tcPr>
           <w:p>
@@ -1959,13 +2638,13 @@
                 <w:color w:val="FFFFFF"/>
                 <w:sz w:val="18"/>
               </w:rPr>
-              <w:t>Contenu</w:t>
+              <w:t>Localisation</w:t>
             </w:r>
           </w:p>
         </w:tc>
         <w:tc>
           <w:tcPr>
-            <w:tcW w:type="dxa" w:w="3402"/>
+            <w:tcW w:type="dxa" w:w="5669"/>
             <w:shd w:val="clear" w:color="auto" w:fill="2E74B5"/>
           </w:tcPr>
           <w:p>
@@ -1976,7 +2655,7 @@
                 <w:color w:val="FFFFFF"/>
                 <w:sz w:val="18"/>
               </w:rPr>
-              <w:t>Caractéristiques</w:t>
+              <w:t>Contenu / usage pour l'opération</w:t>
             </w:r>
           </w:p>
         </w:tc>
@@ -1984,7 +2663,7 @@
       <w:tr>
         <w:tc>
           <w:tcPr>
-            <w:tcW w:type="dxa" w:w="2835"/>
+            <w:tcW w:type="dxa" w:w="1417"/>
           </w:tcPr>
           <w:p>
             <w:r/>
@@ -1992,13 +2671,13 @@
               <w:rPr>
                 <w:sz w:val="18"/>
               </w:rPr>
-              <w:t>Local 1 — Stockage général / base vie</w:t>
+              <w:t>Local 1</w:t>
             </w:r>
           </w:p>
         </w:tc>
         <w:tc>
           <w:tcPr>
-            <w:tcW w:type="dxa" w:w="3402"/>
+            <w:tcW w:type="dxa" w:w="2551"/>
           </w:tcPr>
           <w:p>
             <w:r/>
@@ -2006,13 +2685,13 @@
               <w:rPr>
                 <w:sz w:val="18"/>
               </w:rPr>
-              <w:t>Outillage commun, EPI, matériel de balisage et de protection</w:t>
+              <w:t>Livry-Gargan (93)</w:t>
             </w:r>
           </w:p>
         </w:tc>
         <w:tc>
           <w:tcPr>
-            <w:tcW w:type="dxa" w:w="3402"/>
+            <w:tcW w:type="dxa" w:w="5669"/>
           </w:tcPr>
           <w:p>
             <w:r/>
@@ -2020,7 +2699,7 @@
               <w:rPr>
                 <w:sz w:val="18"/>
               </w:rPr>
-              <w:t>Local fermé et sécurisé, accès réservé au personnel du lot</w:t>
+              <w:t>Dépôt principal — outillage commun, EPI, matériel de balisage et de protection ; antenne logistique de proximité pour le chantier de Sevran</w:t>
             </w:r>
           </w:p>
         </w:tc>
@@ -2028,7 +2707,7 @@
       <w:tr>
         <w:tc>
           <w:tcPr>
-            <w:tcW w:type="dxa" w:w="2835"/>
+            <w:tcW w:type="dxa" w:w="1417"/>
           </w:tcPr>
           <w:p>
             <w:r/>
@@ -2036,13 +2715,13 @@
               <w:rPr>
                 <w:sz w:val="18"/>
               </w:rPr>
-              <w:t>Local 2 — Stockage faux plafonds</w:t>
+              <w:t>Local 2</w:t>
             </w:r>
           </w:p>
         </w:tc>
         <w:tc>
           <w:tcPr>
-            <w:tcW w:type="dxa" w:w="3402"/>
+            <w:tcW w:type="dxa" w:w="2551"/>
           </w:tcPr>
           <w:p>
             <w:r/>
@@ -2050,13 +2729,13 @@
               <w:rPr>
                 <w:sz w:val="18"/>
               </w:rPr>
-              <w:t>Dalles Ecophon, ossatures, jouées, trappes, grilles de ventilation</w:t>
+              <w:t>La Houssaye-en-Brie (77)</w:t>
             </w:r>
           </w:p>
         </w:tc>
         <w:tc>
           <w:tcPr>
-            <w:tcW w:type="dxa" w:w="3402"/>
+            <w:tcW w:type="dxa" w:w="5669"/>
           </w:tcPr>
           <w:p>
             <w:r/>
@@ -2064,7 +2743,7 @@
               <w:rPr>
                 <w:sz w:val="18"/>
               </w:rPr>
-              <w:t>Zone à l'abri de l'humidité, approvisionnée avant la semaine Faux plafonds</w:t>
+              <w:t>Siège social France Décoration — stock central faux plafonds (dalles Ecophon, ossatures, jouées, trappes, grilles de ventilation)</w:t>
             </w:r>
           </w:p>
         </w:tc>
@@ -2072,7 +2751,7 @@
       <w:tr>
         <w:tc>
           <w:tcPr>
-            <w:tcW w:type="dxa" w:w="2835"/>
+            <w:tcW w:type="dxa" w:w="1417"/>
           </w:tcPr>
           <w:p>
             <w:r/>
@@ -2080,13 +2759,13 @@
               <w:rPr>
                 <w:sz w:val="18"/>
               </w:rPr>
-              <w:t>Local 3 — Stockage peinture et produits chimiques</w:t>
+              <w:t>Local 3</w:t>
             </w:r>
           </w:p>
         </w:tc>
         <w:tc>
           <w:tcPr>
-            <w:tcW w:type="dxa" w:w="3402"/>
+            <w:tcW w:type="dxa" w:w="2551"/>
           </w:tcPr>
           <w:p>
             <w:r/>
@@ -2094,13 +2773,13 @@
               <w:rPr>
                 <w:sz w:val="18"/>
               </w:rPr>
-              <w:t>Peintures, enduits, primaires, colles</w:t>
+              <w:t>Saint-Ouen (93)</w:t>
             </w:r>
           </w:p>
         </w:tc>
         <w:tc>
           <w:tcPr>
-            <w:tcW w:type="dxa" w:w="3402"/>
+            <w:tcW w:type="dxa" w:w="5669"/>
           </w:tcPr>
           <w:p>
             <w:r/>
@@ -2108,7 +2787,7 @@
               <w:rPr>
                 <w:sz w:val="18"/>
               </w:rPr>
-              <w:t>Local ventilé, tenu à l'écart de toute source d'inflammation, conforme aux fiches de données de sécurité des produits</w:t>
+              <w:t>Stockage peinture et produits chimiques (peintures, enduits, primaires, colles), local ventilé tenu à l'écart de toute source d'inflammation</w:t>
             </w:r>
           </w:p>
         </w:tc>
@@ -2116,7 +2795,7 @@
       <w:tr>
         <w:tc>
           <w:tcPr>
-            <w:tcW w:type="dxa" w:w="2835"/>
+            <w:tcW w:type="dxa" w:w="1417"/>
           </w:tcPr>
           <w:p>
             <w:r/>
@@ -2124,13 +2803,13 @@
               <w:rPr>
                 <w:sz w:val="18"/>
               </w:rPr>
-              <w:t>Local 4 — Stockage sols souples</w:t>
+              <w:t>Local 4</w:t>
             </w:r>
           </w:p>
         </w:tc>
         <w:tc>
           <w:tcPr>
-            <w:tcW w:type="dxa" w:w="3402"/>
+            <w:tcW w:type="dxa" w:w="2551"/>
           </w:tcPr>
           <w:p>
             <w:r/>
@@ -2138,13 +2817,13 @@
               <w:rPr>
                 <w:sz w:val="18"/>
               </w:rPr>
-              <w:t>Rouleaux et lés de revêtements, ragréages, barres de seuil</w:t>
+              <w:t>Paris</w:t>
             </w:r>
           </w:p>
         </w:tc>
         <w:tc>
           <w:tcPr>
-            <w:tcW w:type="dxa" w:w="3402"/>
+            <w:tcW w:type="dxa" w:w="5669"/>
           </w:tcPr>
           <w:p>
             <w:r/>
@@ -2152,7 +2831,7 @@
               <w:rPr>
                 <w:sz w:val="18"/>
               </w:rPr>
-              <w:t>Stockage à plat ou vertical protégé, à l'abri des chocs et de l'humidité</w:t>
+              <w:t>Dépôt de proximité — rouleaux et lés de revêtements de sols souples, ragréages, barres de seuil</w:t>
             </w:r>
           </w:p>
         </w:tc>
@@ -2166,7 +2845,7 @@
           <w:i/>
           <w:sz w:val="21"/>
         </w:rPr>
-        <w:t>Ces quatre locaux sont positionnés en coordination avec le Maître d'Œuvre dès la période de préparation de chantier, à proximité de la zone d'intervention afin de limiter les manutentions dans les circulations de l'établissement.</w:t>
+        <w:t>Ce maillage de quatre dépôts permet un réapprovisionnement rapide du chantier de l'hôpital René Muret (Sevran) sans immobilisation prolongée de stocks sur site, en coordination avec le Maître d'Œuvre dès la période de préparation de chantier.</w:t>
       </w:r>
     </w:p>
     <w:p>

</xml_diff>

<commit_message>
Étoffe significativement les moyens matériels (§3.6 à 3.11)
Passe d'une liste sommaire à des tableaux détaillés avec quantités
indicatives et usages précis : matériel commun de chantier (§3.6,
17 postes), outillage spécifique faux plafonds (§3.7, 13 postes),
peinture (§3.8, 13 postes) et sols souples (§3.9, 14 postes),
moyens de protection/aspiration/confinement amiante (§3.10,
11 postes), et moyens de transport/manutention (§3.11).

Co-Authored-By: Claude Sonnet 5 <noreply@anthropic.com>
Claude-Session: https://claude.ai/code/session_016J8ZBxzUkBqS3C16QP9P63
</commit_message>
<xml_diff>
--- a/livrables/Lot3_Chapitre3_MoyensHumainsMateriels.docx
+++ b/livrables/Lot3_Chapitre3_MoyensHumainsMateriels.docx
@@ -2339,7 +2339,7 @@
           <w:i w:val="0"/>
           <w:sz w:val="21"/>
         </w:rPr>
-        <w:t>Au-delà des matériels spécifiques à chaque corps de métier (cf. § 3.7 à 3.9), le chantier est équipé de moyens communs mutualisés entre les équipes.</w:t>
+        <w:t>Au-delà des matériels spécifiques à chaque corps de métier (cf. § 3.7 à 3.9), le chantier est équipé de moyens communs mutualisés entre les équipes, dimensionnés pour l'ensemble de l'opération.</w:t>
       </w:r>
     </w:p>
     <w:tbl>
@@ -2350,13 +2350,14 @@
         <w:tblLook w:firstColumn="1" w:firstRow="1" w:lastColumn="0" w:lastRow="0" w:noHBand="0" w:noVBand="1" w:val="04A0"/>
       </w:tblPr>
       <w:tblGrid>
-        <w:gridCol w:w="5100"/>
-        <w:gridCol w:w="5100"/>
+        <w:gridCol w:w="3400"/>
+        <w:gridCol w:w="3400"/>
+        <w:gridCol w:w="3400"/>
       </w:tblGrid>
       <w:tr>
         <w:tc>
           <w:tcPr>
-            <w:tcW w:type="dxa" w:w="3969"/>
+            <w:tcW w:type="dxa" w:w="3685"/>
             <w:shd w:val="clear" w:color="auto" w:fill="2E74B5"/>
           </w:tcPr>
           <w:p>
@@ -2373,7 +2374,7 @@
         </w:tc>
         <w:tc>
           <w:tcPr>
-            <w:tcW w:type="dxa" w:w="4535"/>
+            <w:tcW w:type="dxa" w:w="1701"/>
             <w:shd w:val="clear" w:color="auto" w:fill="2E74B5"/>
           </w:tcPr>
           <w:p>
@@ -2384,6 +2385,23 @@
                 <w:color w:val="FFFFFF"/>
                 <w:sz w:val="18"/>
               </w:rPr>
+              <w:t>Quantité indicative</w:t>
+            </w:r>
+          </w:p>
+        </w:tc>
+        <w:tc>
+          <w:tcPr>
+            <w:tcW w:type="dxa" w:w="3118"/>
+            <w:shd w:val="clear" w:color="auto" w:fill="2E74B5"/>
+          </w:tcPr>
+          <w:p>
+            <w:r/>
+            <w:r>
+              <w:rPr>
+                <w:b/>
+                <w:color w:val="FFFFFF"/>
+                <w:sz w:val="18"/>
+              </w:rPr>
               <w:t>Usage</w:t>
             </w:r>
           </w:p>
@@ -2392,29 +2410,43 @@
       <w:tr>
         <w:tc>
           <w:tcPr>
-            <w:tcW w:type="dxa" w:w="3969"/>
-          </w:tcPr>
-          <w:p>
-            <w:r/>
-            <w:r>
-              <w:rPr>
-                <w:sz w:val="18"/>
-              </w:rPr>
-              <w:t>Échafaudages roulants et plateformes individuelles roulantes (PIR)</w:t>
-            </w:r>
-          </w:p>
-        </w:tc>
-        <w:tc>
-          <w:tcPr>
-            <w:tcW w:type="dxa" w:w="4535"/>
-          </w:tcPr>
-          <w:p>
-            <w:r/>
-            <w:r>
-              <w:rPr>
-                <w:sz w:val="18"/>
-              </w:rPr>
-              <w:t>Accès aux plafonds et parties hautes</w:t>
+            <w:tcW w:type="dxa" w:w="3685"/>
+          </w:tcPr>
+          <w:p>
+            <w:r/>
+            <w:r>
+              <w:rPr>
+                <w:sz w:val="18"/>
+              </w:rPr>
+              <w:t>Échafaudage roulant multidirectionnel</w:t>
+            </w:r>
+          </w:p>
+        </w:tc>
+        <w:tc>
+          <w:tcPr>
+            <w:tcW w:type="dxa" w:w="1701"/>
+          </w:tcPr>
+          <w:p>
+            <w:r/>
+            <w:r>
+              <w:rPr>
+                <w:sz w:val="18"/>
+              </w:rPr>
+              <w:t>1 unité</w:t>
+            </w:r>
+          </w:p>
+        </w:tc>
+        <w:tc>
+          <w:tcPr>
+            <w:tcW w:type="dxa" w:w="3118"/>
+          </w:tcPr>
+          <w:p>
+            <w:r/>
+            <w:r>
+              <w:rPr>
+                <w:sz w:val="18"/>
+              </w:rPr>
+              <w:t>Accès sécurisé aux plafonds et parties hautes, déplaçable local par local</w:t>
             </w:r>
           </w:p>
         </w:tc>
@@ -2422,29 +2454,43 @@
       <w:tr>
         <w:tc>
           <w:tcPr>
-            <w:tcW w:type="dxa" w:w="3969"/>
-          </w:tcPr>
-          <w:p>
-            <w:r/>
-            <w:r>
-              <w:rPr>
-                <w:sz w:val="18"/>
-              </w:rPr>
-              <w:t>Outillage électroportatif (perceuses, visseuses, scies)</w:t>
-            </w:r>
-          </w:p>
-        </w:tc>
-        <w:tc>
-          <w:tcPr>
-            <w:tcW w:type="dxa" w:w="4535"/>
-          </w:tcPr>
-          <w:p>
-            <w:r/>
-            <w:r>
-              <w:rPr>
-                <w:sz w:val="18"/>
-              </w:rPr>
-              <w:t>Découpes et fixations</w:t>
+            <w:tcW w:type="dxa" w:w="3685"/>
+          </w:tcPr>
+          <w:p>
+            <w:r/>
+            <w:r>
+              <w:rPr>
+                <w:sz w:val="18"/>
+              </w:rPr>
+              <w:t>Plateformes individuelles roulantes (PIR)</w:t>
+            </w:r>
+          </w:p>
+        </w:tc>
+        <w:tc>
+          <w:tcPr>
+            <w:tcW w:type="dxa" w:w="1701"/>
+          </w:tcPr>
+          <w:p>
+            <w:r/>
+            <w:r>
+              <w:rPr>
+                <w:sz w:val="18"/>
+              </w:rPr>
+              <w:t>2 unités</w:t>
+            </w:r>
+          </w:p>
+        </w:tc>
+        <w:tc>
+          <w:tcPr>
+            <w:tcW w:type="dxa" w:w="3118"/>
+          </w:tcPr>
+          <w:p>
+            <w:r/>
+            <w:r>
+              <w:rPr>
+                <w:sz w:val="18"/>
+              </w:rPr>
+              <w:t>Interventions ponctuelles en hauteur pour un seul opérateur</w:t>
             </w:r>
           </w:p>
         </w:tc>
@@ -2452,29 +2498,43 @@
       <w:tr>
         <w:tc>
           <w:tcPr>
-            <w:tcW w:type="dxa" w:w="3969"/>
-          </w:tcPr>
-          <w:p>
-            <w:r/>
-            <w:r>
-              <w:rPr>
-                <w:sz w:val="18"/>
-              </w:rPr>
-              <w:t>Aspirateurs de chantier à filtration</w:t>
-            </w:r>
-          </w:p>
-        </w:tc>
-        <w:tc>
-          <w:tcPr>
-            <w:tcW w:type="dxa" w:w="4535"/>
-          </w:tcPr>
-          <w:p>
-            <w:r/>
-            <w:r>
-              <w:rPr>
-                <w:sz w:val="18"/>
-              </w:rPr>
-              <w:t>Maîtrise des poussières lors des préparations de supports</w:t>
+            <w:tcW w:type="dxa" w:w="3685"/>
+          </w:tcPr>
+          <w:p>
+            <w:r/>
+            <w:r>
+              <w:rPr>
+                <w:sz w:val="18"/>
+              </w:rPr>
+              <w:t>Escabeaux et échelles télescopiques</w:t>
+            </w:r>
+          </w:p>
+        </w:tc>
+        <w:tc>
+          <w:tcPr>
+            <w:tcW w:type="dxa" w:w="1701"/>
+          </w:tcPr>
+          <w:p>
+            <w:r/>
+            <w:r>
+              <w:rPr>
+                <w:sz w:val="18"/>
+              </w:rPr>
+              <w:t>4 unités</w:t>
+            </w:r>
+          </w:p>
+        </w:tc>
+        <w:tc>
+          <w:tcPr>
+            <w:tcW w:type="dxa" w:w="3118"/>
+          </w:tcPr>
+          <w:p>
+            <w:r/>
+            <w:r>
+              <w:rPr>
+                <w:sz w:val="18"/>
+              </w:rPr>
+              <w:t>Accès complémentaires aux plateformes selon la configuration des locaux</w:t>
             </w:r>
           </w:p>
         </w:tc>
@@ -2482,29 +2542,43 @@
       <w:tr>
         <w:tc>
           <w:tcPr>
-            <w:tcW w:type="dxa" w:w="3969"/>
-          </w:tcPr>
-          <w:p>
-            <w:r/>
-            <w:r>
-              <w:rPr>
-                <w:sz w:val="18"/>
-              </w:rPr>
-              <w:t>Équipements de protection individuelle (EPI)</w:t>
-            </w:r>
-          </w:p>
-        </w:tc>
-        <w:tc>
-          <w:tcPr>
-            <w:tcW w:type="dxa" w:w="4535"/>
-          </w:tcPr>
-          <w:p>
-            <w:r/>
-            <w:r>
-              <w:rPr>
-                <w:sz w:val="18"/>
-              </w:rPr>
-              <w:t>Casques, gants, lunettes, masques, chaussures de sécurité</w:t>
+            <w:tcW w:type="dxa" w:w="3685"/>
+          </w:tcPr>
+          <w:p>
+            <w:r/>
+            <w:r>
+              <w:rPr>
+                <w:sz w:val="18"/>
+              </w:rPr>
+              <w:t>Perceuses-visseuses sans fil</w:t>
+            </w:r>
+          </w:p>
+        </w:tc>
+        <w:tc>
+          <w:tcPr>
+            <w:tcW w:type="dxa" w:w="1701"/>
+          </w:tcPr>
+          <w:p>
+            <w:r/>
+            <w:r>
+              <w:rPr>
+                <w:sz w:val="18"/>
+              </w:rPr>
+              <w:t>4 unités</w:t>
+            </w:r>
+          </w:p>
+        </w:tc>
+        <w:tc>
+          <w:tcPr>
+            <w:tcW w:type="dxa" w:w="3118"/>
+          </w:tcPr>
+          <w:p>
+            <w:r/>
+            <w:r>
+              <w:rPr>
+                <w:sz w:val="18"/>
+              </w:rPr>
+              <w:t>Fixation des ossatures, plaques et accessoires</w:t>
             </w:r>
           </w:p>
         </w:tc>
@@ -2512,29 +2586,43 @@
       <w:tr>
         <w:tc>
           <w:tcPr>
-            <w:tcW w:type="dxa" w:w="3969"/>
-          </w:tcPr>
-          <w:p>
-            <w:r/>
-            <w:r>
-              <w:rPr>
-                <w:sz w:val="18"/>
-              </w:rPr>
-              <w:t>Matériel de signalétique et de balisage de chantier</w:t>
-            </w:r>
-          </w:p>
-        </w:tc>
-        <w:tc>
-          <w:tcPr>
-            <w:tcW w:type="dxa" w:w="4535"/>
-          </w:tcPr>
-          <w:p>
-            <w:r/>
-            <w:r>
-              <w:rPr>
-                <w:sz w:val="18"/>
-              </w:rPr>
-              <w:t>Délimitation des zones de travaux en site occupé</w:t>
+            <w:tcW w:type="dxa" w:w="3685"/>
+          </w:tcPr>
+          <w:p>
+            <w:r/>
+            <w:r>
+              <w:rPr>
+                <w:sz w:val="18"/>
+              </w:rPr>
+              <w:t>Perforateurs</w:t>
+            </w:r>
+          </w:p>
+        </w:tc>
+        <w:tc>
+          <w:tcPr>
+            <w:tcW w:type="dxa" w:w="1701"/>
+          </w:tcPr>
+          <w:p>
+            <w:r/>
+            <w:r>
+              <w:rPr>
+                <w:sz w:val="18"/>
+              </w:rPr>
+              <w:t>2 unités</w:t>
+            </w:r>
+          </w:p>
+        </w:tc>
+        <w:tc>
+          <w:tcPr>
+            <w:tcW w:type="dxa" w:w="3118"/>
+          </w:tcPr>
+          <w:p>
+            <w:r/>
+            <w:r>
+              <w:rPr>
+                <w:sz w:val="18"/>
+              </w:rPr>
+              <w:t>Fixation des suspentes et chevillage en plafond béton</w:t>
             </w:r>
           </w:p>
         </w:tc>
@@ -2542,29 +2630,527 @@
       <w:tr>
         <w:tc>
           <w:tcPr>
-            <w:tcW w:type="dxa" w:w="3969"/>
-          </w:tcPr>
-          <w:p>
-            <w:r/>
-            <w:r>
-              <w:rPr>
-                <w:sz w:val="18"/>
-              </w:rPr>
-              <w:t>Bacs et contenants de tri sélectif</w:t>
-            </w:r>
-          </w:p>
-        </w:tc>
-        <w:tc>
-          <w:tcPr>
-            <w:tcW w:type="dxa" w:w="4535"/>
-          </w:tcPr>
-          <w:p>
-            <w:r/>
-            <w:r>
-              <w:rPr>
-                <w:sz w:val="18"/>
-              </w:rPr>
-              <w:t>Gestion et traçabilité des déchets de chantier</w:t>
+            <w:tcW w:type="dxa" w:w="3685"/>
+          </w:tcPr>
+          <w:p>
+            <w:r/>
+            <w:r>
+              <w:rPr>
+                <w:sz w:val="18"/>
+              </w:rPr>
+              <w:t>Scies (sauteuse, scie cloche, disqueuse)</w:t>
+            </w:r>
+          </w:p>
+        </w:tc>
+        <w:tc>
+          <w:tcPr>
+            <w:tcW w:type="dxa" w:w="1701"/>
+          </w:tcPr>
+          <w:p>
+            <w:r/>
+            <w:r>
+              <w:rPr>
+                <w:sz w:val="18"/>
+              </w:rPr>
+              <w:t>1 jeu par équipe</w:t>
+            </w:r>
+          </w:p>
+        </w:tc>
+        <w:tc>
+          <w:tcPr>
+            <w:tcW w:type="dxa" w:w="3118"/>
+          </w:tcPr>
+          <w:p>
+            <w:r/>
+            <w:r>
+              <w:rPr>
+                <w:sz w:val="18"/>
+              </w:rPr>
+              <w:t>Découpes de plaques, profilés et revêtements</w:t>
+            </w:r>
+          </w:p>
+        </w:tc>
+      </w:tr>
+      <w:tr>
+        <w:tc>
+          <w:tcPr>
+            <w:tcW w:type="dxa" w:w="3685"/>
+          </w:tcPr>
+          <w:p>
+            <w:r/>
+            <w:r>
+              <w:rPr>
+                <w:sz w:val="18"/>
+              </w:rPr>
+              <w:t>Aspirateurs de chantier à filtration (classe M/H selon opération)</w:t>
+            </w:r>
+          </w:p>
+        </w:tc>
+        <w:tc>
+          <w:tcPr>
+            <w:tcW w:type="dxa" w:w="1701"/>
+          </w:tcPr>
+          <w:p>
+            <w:r/>
+            <w:r>
+              <w:rPr>
+                <w:sz w:val="18"/>
+              </w:rPr>
+              <w:t>3 unités</w:t>
+            </w:r>
+          </w:p>
+        </w:tc>
+        <w:tc>
+          <w:tcPr>
+            <w:tcW w:type="dxa" w:w="3118"/>
+          </w:tcPr>
+          <w:p>
+            <w:r/>
+            <w:r>
+              <w:rPr>
+                <w:sz w:val="18"/>
+              </w:rPr>
+              <w:t>Maîtrise des poussières lors des préparations de supports et découpes</w:t>
+            </w:r>
+          </w:p>
+        </w:tc>
+      </w:tr>
+      <w:tr>
+        <w:tc>
+          <w:tcPr>
+            <w:tcW w:type="dxa" w:w="3685"/>
+          </w:tcPr>
+          <w:p>
+            <w:r/>
+            <w:r>
+              <w:rPr>
+                <w:sz w:val="18"/>
+              </w:rPr>
+              <w:t>Détecteur multifonction de réseaux (électricité, métal, bois)</w:t>
+            </w:r>
+          </w:p>
+        </w:tc>
+        <w:tc>
+          <w:tcPr>
+            <w:tcW w:type="dxa" w:w="1701"/>
+          </w:tcPr>
+          <w:p>
+            <w:r/>
+            <w:r>
+              <w:rPr>
+                <w:sz w:val="18"/>
+              </w:rPr>
+              <w:t>1 unité</w:t>
+            </w:r>
+          </w:p>
+        </w:tc>
+        <w:tc>
+          <w:tcPr>
+            <w:tcW w:type="dxa" w:w="3118"/>
+          </w:tcPr>
+          <w:p>
+            <w:r/>
+            <w:r>
+              <w:rPr>
+                <w:sz w:val="18"/>
+              </w:rPr>
+              <w:t>Repérage des réseaux existants avant perçage en plafond ou en cloison</w:t>
+            </w:r>
+          </w:p>
+        </w:tc>
+      </w:tr>
+      <w:tr>
+        <w:tc>
+          <w:tcPr>
+            <w:tcW w:type="dxa" w:w="3685"/>
+          </w:tcPr>
+          <w:p>
+            <w:r/>
+            <w:r>
+              <w:rPr>
+                <w:sz w:val="18"/>
+              </w:rPr>
+              <w:t>Niveaux laser (rotatif et croix) et mètres laser</w:t>
+            </w:r>
+          </w:p>
+        </w:tc>
+        <w:tc>
+          <w:tcPr>
+            <w:tcW w:type="dxa" w:w="1701"/>
+          </w:tcPr>
+          <w:p>
+            <w:r/>
+            <w:r>
+              <w:rPr>
+                <w:sz w:val="18"/>
+              </w:rPr>
+              <w:t>2 unités</w:t>
+            </w:r>
+          </w:p>
+        </w:tc>
+        <w:tc>
+          <w:tcPr>
+            <w:tcW w:type="dxa" w:w="3118"/>
+          </w:tcPr>
+          <w:p>
+            <w:r/>
+            <w:r>
+              <w:rPr>
+                <w:sz w:val="18"/>
+              </w:rPr>
+              <w:t>Traçage, implantation et contrôle de planéité, communs aux trois corps de métier</w:t>
+            </w:r>
+          </w:p>
+        </w:tc>
+      </w:tr>
+      <w:tr>
+        <w:tc>
+          <w:tcPr>
+            <w:tcW w:type="dxa" w:w="3685"/>
+          </w:tcPr>
+          <w:p>
+            <w:r/>
+            <w:r>
+              <w:rPr>
+                <w:sz w:val="18"/>
+              </w:rPr>
+              <w:t>Groupe électrogène ou tableau électrique de chantier temporaire (avec disjoncteur différentiel)</w:t>
+            </w:r>
+          </w:p>
+        </w:tc>
+        <w:tc>
+          <w:tcPr>
+            <w:tcW w:type="dxa" w:w="1701"/>
+          </w:tcPr>
+          <w:p>
+            <w:r/>
+            <w:r>
+              <w:rPr>
+                <w:sz w:val="18"/>
+              </w:rPr>
+              <w:t>1 unité</w:t>
+            </w:r>
+          </w:p>
+        </w:tc>
+        <w:tc>
+          <w:tcPr>
+            <w:tcW w:type="dxa" w:w="3118"/>
+          </w:tcPr>
+          <w:p>
+            <w:r/>
+            <w:r>
+              <w:rPr>
+                <w:sz w:val="18"/>
+              </w:rPr>
+              <w:t>Alimentation électrique sécurisée des outils, en coordination avec le Lot 4 Électricité</w:t>
+            </w:r>
+          </w:p>
+        </w:tc>
+      </w:tr>
+      <w:tr>
+        <w:tc>
+          <w:tcPr>
+            <w:tcW w:type="dxa" w:w="3685"/>
+          </w:tcPr>
+          <w:p>
+            <w:r/>
+            <w:r>
+              <w:rPr>
+                <w:sz w:val="18"/>
+              </w:rPr>
+              <w:t>Éclairage de chantier (baladeuses LED, projecteurs sur trépied)</w:t>
+            </w:r>
+          </w:p>
+        </w:tc>
+        <w:tc>
+          <w:tcPr>
+            <w:tcW w:type="dxa" w:w="1701"/>
+          </w:tcPr>
+          <w:p>
+            <w:r/>
+            <w:r>
+              <w:rPr>
+                <w:sz w:val="18"/>
+              </w:rPr>
+              <w:t>Selon locaux</w:t>
+            </w:r>
+          </w:p>
+        </w:tc>
+        <w:tc>
+          <w:tcPr>
+            <w:tcW w:type="dxa" w:w="3118"/>
+          </w:tcPr>
+          <w:p>
+            <w:r/>
+            <w:r>
+              <w:rPr>
+                <w:sz w:val="18"/>
+              </w:rPr>
+              <w:t>Éclairage d'appoint dans les zones en cours de travaux</w:t>
+            </w:r>
+          </w:p>
+        </w:tc>
+      </w:tr>
+      <w:tr>
+        <w:tc>
+          <w:tcPr>
+            <w:tcW w:type="dxa" w:w="3685"/>
+          </w:tcPr>
+          <w:p>
+            <w:r/>
+            <w:r>
+              <w:rPr>
+                <w:sz w:val="18"/>
+              </w:rPr>
+              <w:t>Radios / talkies-walkies</w:t>
+            </w:r>
+          </w:p>
+        </w:tc>
+        <w:tc>
+          <w:tcPr>
+            <w:tcW w:type="dxa" w:w="1701"/>
+          </w:tcPr>
+          <w:p>
+            <w:r/>
+            <w:r>
+              <w:rPr>
+                <w:sz w:val="18"/>
+              </w:rPr>
+              <w:t>1 par chef d'équipe</w:t>
+            </w:r>
+          </w:p>
+        </w:tc>
+        <w:tc>
+          <w:tcPr>
+            <w:tcW w:type="dxa" w:w="3118"/>
+          </w:tcPr>
+          <w:p>
+            <w:r/>
+            <w:r>
+              <w:rPr>
+                <w:sz w:val="18"/>
+              </w:rPr>
+              <w:t>Coordination instantanée entre équipes et avec le Chef de Chantier</w:t>
+            </w:r>
+          </w:p>
+        </w:tc>
+      </w:tr>
+      <w:tr>
+        <w:tc>
+          <w:tcPr>
+            <w:tcW w:type="dxa" w:w="3685"/>
+          </w:tcPr>
+          <w:p>
+            <w:r/>
+            <w:r>
+              <w:rPr>
+                <w:sz w:val="18"/>
+              </w:rPr>
+              <w:t>Équipements de protection individuelle (EPI)</w:t>
+            </w:r>
+          </w:p>
+        </w:tc>
+        <w:tc>
+          <w:tcPr>
+            <w:tcW w:type="dxa" w:w="1701"/>
+          </w:tcPr>
+          <w:p>
+            <w:r/>
+            <w:r>
+              <w:rPr>
+                <w:sz w:val="18"/>
+              </w:rPr>
+              <w:t>1 dotation complète par intervenant</w:t>
+            </w:r>
+          </w:p>
+        </w:tc>
+        <w:tc>
+          <w:tcPr>
+            <w:tcW w:type="dxa" w:w="3118"/>
+          </w:tcPr>
+          <w:p>
+            <w:r/>
+            <w:r>
+              <w:rPr>
+                <w:sz w:val="18"/>
+              </w:rPr>
+              <w:t>Casques, gants, lunettes, masques, chaussures de sécurité, protections auditives</w:t>
+            </w:r>
+          </w:p>
+        </w:tc>
+      </w:tr>
+      <w:tr>
+        <w:tc>
+          <w:tcPr>
+            <w:tcW w:type="dxa" w:w="3685"/>
+          </w:tcPr>
+          <w:p>
+            <w:r/>
+            <w:r>
+              <w:rPr>
+                <w:sz w:val="18"/>
+              </w:rPr>
+              <w:t>Matériel de signalétique et de balisage de chantier</w:t>
+            </w:r>
+          </w:p>
+        </w:tc>
+        <w:tc>
+          <w:tcPr>
+            <w:tcW w:type="dxa" w:w="1701"/>
+          </w:tcPr>
+          <w:p>
+            <w:r/>
+            <w:r>
+              <w:rPr>
+                <w:sz w:val="18"/>
+              </w:rPr>
+              <w:t>Selon emprise</w:t>
+            </w:r>
+          </w:p>
+        </w:tc>
+        <w:tc>
+          <w:tcPr>
+            <w:tcW w:type="dxa" w:w="3118"/>
+          </w:tcPr>
+          <w:p>
+            <w:r/>
+            <w:r>
+              <w:rPr>
+                <w:sz w:val="18"/>
+              </w:rPr>
+              <w:t>Rubalise, panneaux, barrières, délimitation des zones de travaux en site occupé</w:t>
+            </w:r>
+          </w:p>
+        </w:tc>
+      </w:tr>
+      <w:tr>
+        <w:tc>
+          <w:tcPr>
+            <w:tcW w:type="dxa" w:w="3685"/>
+          </w:tcPr>
+          <w:p>
+            <w:r/>
+            <w:r>
+              <w:rPr>
+                <w:sz w:val="18"/>
+              </w:rPr>
+              <w:t>Extincteurs portatifs et trousse de premiers secours</w:t>
+            </w:r>
+          </w:p>
+        </w:tc>
+        <w:tc>
+          <w:tcPr>
+            <w:tcW w:type="dxa" w:w="1701"/>
+          </w:tcPr>
+          <w:p>
+            <w:r/>
+            <w:r>
+              <w:rPr>
+                <w:sz w:val="18"/>
+              </w:rPr>
+              <w:t>1 par zone de stockage/travail</w:t>
+            </w:r>
+          </w:p>
+        </w:tc>
+        <w:tc>
+          <w:tcPr>
+            <w:tcW w:type="dxa" w:w="3118"/>
+          </w:tcPr>
+          <w:p>
+            <w:r/>
+            <w:r>
+              <w:rPr>
+                <w:sz w:val="18"/>
+              </w:rPr>
+              <w:t>Sécurité incendie et intervention d'urgence, en cohérence avec le SSI catégorie A du site</w:t>
+            </w:r>
+          </w:p>
+        </w:tc>
+      </w:tr>
+      <w:tr>
+        <w:tc>
+          <w:tcPr>
+            <w:tcW w:type="dxa" w:w="3685"/>
+          </w:tcPr>
+          <w:p>
+            <w:r/>
+            <w:r>
+              <w:rPr>
+                <w:sz w:val="18"/>
+              </w:rPr>
+              <w:t>Bacs et contenants de tri sélectif (DIB, bois, métal, plâtre, déchets dangereux)</w:t>
+            </w:r>
+          </w:p>
+        </w:tc>
+        <w:tc>
+          <w:tcPr>
+            <w:tcW w:type="dxa" w:w="1701"/>
+          </w:tcPr>
+          <w:p>
+            <w:r/>
+            <w:r>
+              <w:rPr>
+                <w:sz w:val="18"/>
+              </w:rPr>
+              <w:t>Selon volumes</w:t>
+            </w:r>
+          </w:p>
+        </w:tc>
+        <w:tc>
+          <w:tcPr>
+            <w:tcW w:type="dxa" w:w="3118"/>
+          </w:tcPr>
+          <w:p>
+            <w:r/>
+            <w:r>
+              <w:rPr>
+                <w:sz w:val="18"/>
+              </w:rPr>
+              <w:t>Gestion et traçabilité des déchets de chantier (cf. chapitre 2, § 2.6)</w:t>
+            </w:r>
+          </w:p>
+        </w:tc>
+      </w:tr>
+      <w:tr>
+        <w:tc>
+          <w:tcPr>
+            <w:tcW w:type="dxa" w:w="3685"/>
+          </w:tcPr>
+          <w:p>
+            <w:r/>
+            <w:r>
+              <w:rPr>
+                <w:sz w:val="18"/>
+              </w:rPr>
+              <w:t>Container ou algeco de chantier (base vie/tampon sur site)</w:t>
+            </w:r>
+          </w:p>
+        </w:tc>
+        <w:tc>
+          <w:tcPr>
+            <w:tcW w:type="dxa" w:w="1701"/>
+          </w:tcPr>
+          <w:p>
+            <w:r/>
+            <w:r>
+              <w:rPr>
+                <w:sz w:val="18"/>
+              </w:rPr>
+              <w:t>1 unité</w:t>
+            </w:r>
+          </w:p>
+        </w:tc>
+        <w:tc>
+          <w:tcPr>
+            <w:tcW w:type="dxa" w:w="3118"/>
+          </w:tcPr>
+          <w:p>
+            <w:r/>
+            <w:r>
+              <w:rPr>
+                <w:sz w:val="18"/>
+              </w:rPr>
+              <w:t>Point de stockage tampon quotidien en complément des 4 dépôts régionaux (cf. ci-après)</w:t>
             </w:r>
           </w:p>
         </w:tc>
@@ -2868,7 +3454,7 @@
           <w:i/>
           <w:sz w:val="21"/>
         </w:rPr>
-        <w:t>Matériels mobilisés par l'équipe Rashid Minhas / Imran Shahid / Ali Luqman.</w:t>
+        <w:t>Matériels mobilisés par l'équipe Rashid Minhas / Imran Shahid / Ali Luqman, adaptés à la pose des systèmes Ecophon Hygiène Performance A / Protect Air A et des jouées Placostil.</w:t>
       </w:r>
     </w:p>
     <w:tbl>
@@ -2885,7 +3471,7 @@
       <w:tr>
         <w:tc>
           <w:tcPr>
-            <w:tcW w:type="dxa" w:w="3402"/>
+            <w:tcW w:type="dxa" w:w="3685"/>
             <w:shd w:val="clear" w:color="auto" w:fill="2E74B5"/>
           </w:tcPr>
           <w:p>
@@ -2902,7 +3488,7 @@
         </w:tc>
         <w:tc>
           <w:tcPr>
-            <w:tcW w:type="dxa" w:w="5102"/>
+            <w:tcW w:type="dxa" w:w="4819"/>
             <w:shd w:val="clear" w:color="auto" w:fill="2E74B5"/>
           </w:tcPr>
           <w:p>
@@ -2921,29 +3507,29 @@
       <w:tr>
         <w:tc>
           <w:tcPr>
-            <w:tcW w:type="dxa" w:w="3402"/>
-          </w:tcPr>
-          <w:p>
-            <w:r/>
-            <w:r>
-              <w:rPr>
-                <w:sz w:val="18"/>
-              </w:rPr>
-              <w:t>Niveau laser rotatif</w:t>
-            </w:r>
-          </w:p>
-        </w:tc>
-        <w:tc>
-          <w:tcPr>
-            <w:tcW w:type="dxa" w:w="5102"/>
-          </w:tcPr>
-          <w:p>
-            <w:r/>
-            <w:r>
-              <w:rPr>
-                <w:sz w:val="18"/>
-              </w:rPr>
-              <w:t>Traçage et implantation de l'ossature</w:t>
+            <w:tcW w:type="dxa" w:w="3685"/>
+          </w:tcPr>
+          <w:p>
+            <w:r/>
+            <w:r>
+              <w:rPr>
+                <w:sz w:val="18"/>
+              </w:rPr>
+              <w:t>Niveau laser rotatif et cordeau traceur</w:t>
+            </w:r>
+          </w:p>
+        </w:tc>
+        <w:tc>
+          <w:tcPr>
+            <w:tcW w:type="dxa" w:w="4819"/>
+          </w:tcPr>
+          <w:p>
+            <w:r/>
+            <w:r>
+              <w:rPr>
+                <w:sz w:val="18"/>
+              </w:rPr>
+              <w:t>Traçage et implantation de l'ossature en plafond</w:t>
             </w:r>
           </w:p>
         </w:tc>
@@ -2951,29 +3537,29 @@
       <w:tr>
         <w:tc>
           <w:tcPr>
-            <w:tcW w:type="dxa" w:w="3402"/>
-          </w:tcPr>
-          <w:p>
-            <w:r/>
-            <w:r>
-              <w:rPr>
-                <w:sz w:val="18"/>
-              </w:rPr>
-              <w:t>Visseuses et perceuses adaptées</w:t>
-            </w:r>
-          </w:p>
-        </w:tc>
-        <w:tc>
-          <w:tcPr>
-            <w:tcW w:type="dxa" w:w="5102"/>
-          </w:tcPr>
-          <w:p>
-            <w:r/>
-            <w:r>
-              <w:rPr>
-                <w:sz w:val="18"/>
-              </w:rPr>
-              <w:t>Fixation des profils et suspentes</w:t>
+            <w:tcW w:type="dxa" w:w="3685"/>
+          </w:tcPr>
+          <w:p>
+            <w:r/>
+            <w:r>
+              <w:rPr>
+                <w:sz w:val="18"/>
+              </w:rPr>
+              <w:t>Perforateur avec forets adaptés au béton</w:t>
+            </w:r>
+          </w:p>
+        </w:tc>
+        <w:tc>
+          <w:tcPr>
+            <w:tcW w:type="dxa" w:w="4819"/>
+          </w:tcPr>
+          <w:p>
+            <w:r/>
+            <w:r>
+              <w:rPr>
+                <w:sz w:val="18"/>
+              </w:rPr>
+              <w:t>Fixation des suspentes réglables et des attaches de cornières périphériques</w:t>
             </w:r>
           </w:p>
         </w:tc>
@@ -2981,29 +3567,29 @@
       <w:tr>
         <w:tc>
           <w:tcPr>
-            <w:tcW w:type="dxa" w:w="3402"/>
-          </w:tcPr>
-          <w:p>
-            <w:r/>
-            <w:r>
-              <w:rPr>
-                <w:sz w:val="18"/>
-              </w:rPr>
-              <w:t>Coupe-dalles / outillage de découpe</w:t>
-            </w:r>
-          </w:p>
-        </w:tc>
-        <w:tc>
-          <w:tcPr>
-            <w:tcW w:type="dxa" w:w="5102"/>
-          </w:tcPr>
-          <w:p>
-            <w:r/>
-            <w:r>
-              <w:rPr>
-                <w:sz w:val="18"/>
-              </w:rPr>
-              <w:t>Coupes d'onglets et ajustements aux changements de direction</w:t>
+            <w:tcW w:type="dxa" w:w="3685"/>
+          </w:tcPr>
+          <w:p>
+            <w:r/>
+            <w:r>
+              <w:rPr>
+                <w:sz w:val="18"/>
+              </w:rPr>
+              <w:t>Visseuses avec embouts dédiés</w:t>
+            </w:r>
+          </w:p>
+        </w:tc>
+        <w:tc>
+          <w:tcPr>
+            <w:tcW w:type="dxa" w:w="4819"/>
+          </w:tcPr>
+          <w:p>
+            <w:r/>
+            <w:r>
+              <w:rPr>
+                <w:sz w:val="18"/>
+              </w:rPr>
+              <w:t>Fixation des profils T24, des vis TTPC 25 et des plaques BA13 des jouées</w:t>
             </w:r>
           </w:p>
         </w:tc>
@@ -3011,29 +3597,29 @@
       <w:tr>
         <w:tc>
           <w:tcPr>
-            <w:tcW w:type="dxa" w:w="3402"/>
-          </w:tcPr>
-          <w:p>
-            <w:r/>
-            <w:r>
-              <w:rPr>
-                <w:sz w:val="18"/>
-              </w:rPr>
-              <w:t>Plateformes individuelles roulantes</w:t>
-            </w:r>
-          </w:p>
-        </w:tc>
-        <w:tc>
-          <w:tcPr>
-            <w:tcW w:type="dxa" w:w="5102"/>
-          </w:tcPr>
-          <w:p>
-            <w:r/>
-            <w:r>
-              <w:rPr>
-                <w:sz w:val="18"/>
-              </w:rPr>
-              <w:t>Travail en hauteur sécurisé sous plafond</w:t>
+            <w:tcW w:type="dxa" w:w="3685"/>
+          </w:tcPr>
+          <w:p>
+            <w:r/>
+            <w:r>
+              <w:rPr>
+                <w:sz w:val="18"/>
+              </w:rPr>
+              <w:t>Pince à sertir / pince universelle pour profilés métalliques</w:t>
+            </w:r>
+          </w:p>
+        </w:tc>
+        <w:tc>
+          <w:tcPr>
+            <w:tcW w:type="dxa" w:w="4819"/>
+          </w:tcPr>
+          <w:p>
+            <w:r/>
+            <w:r>
+              <w:rPr>
+                <w:sz w:val="18"/>
+              </w:rPr>
+              <w:t>Assemblage et ajustement de l'ossature Stil et des profils Ecophon</w:t>
             </w:r>
           </w:p>
         </w:tc>
@@ -3041,29 +3627,269 @@
       <w:tr>
         <w:tc>
           <w:tcPr>
-            <w:tcW w:type="dxa" w:w="3402"/>
-          </w:tcPr>
-          <w:p>
-            <w:r/>
-            <w:r>
-              <w:rPr>
-                <w:sz w:val="18"/>
-              </w:rPr>
-              <w:t>Règle de contrôle 2 mètres</w:t>
-            </w:r>
-          </w:p>
-        </w:tc>
-        <w:tc>
-          <w:tcPr>
-            <w:tcW w:type="dxa" w:w="5102"/>
-          </w:tcPr>
-          <w:p>
-            <w:r/>
-            <w:r>
-              <w:rPr>
-                <w:sz w:val="18"/>
-              </w:rPr>
-              <w:t>Vérification de la planéité de la sous-face</w:t>
+            <w:tcW w:type="dxa" w:w="3685"/>
+          </w:tcPr>
+          <w:p>
+            <w:r/>
+            <w:r>
+              <w:rPr>
+                <w:sz w:val="18"/>
+              </w:rPr>
+              <w:t>Coupe-dalles et scie à dents fines</w:t>
+            </w:r>
+          </w:p>
+        </w:tc>
+        <w:tc>
+          <w:tcPr>
+            <w:tcW w:type="dxa" w:w="4819"/>
+          </w:tcPr>
+          <w:p>
+            <w:r/>
+            <w:r>
+              <w:rPr>
+                <w:sz w:val="18"/>
+              </w:rPr>
+              <w:t>Coupes d'onglets et ajustements des dalles minérales aux changements de direction</w:t>
+            </w:r>
+          </w:p>
+        </w:tc>
+      </w:tr>
+      <w:tr>
+        <w:tc>
+          <w:tcPr>
+            <w:tcW w:type="dxa" w:w="3685"/>
+          </w:tcPr>
+          <w:p>
+            <w:r/>
+            <w:r>
+              <w:rPr>
+                <w:sz w:val="18"/>
+              </w:rPr>
+              <w:t>Cutter et coupe-plaque</w:t>
+            </w:r>
+          </w:p>
+        </w:tc>
+        <w:tc>
+          <w:tcPr>
+            <w:tcW w:type="dxa" w:w="4819"/>
+          </w:tcPr>
+          <w:p>
+            <w:r/>
+            <w:r>
+              <w:rPr>
+                <w:sz w:val="18"/>
+              </w:rPr>
+              <w:t>Découpe des plaques de plâtre BA13 des jouées</w:t>
+            </w:r>
+          </w:p>
+        </w:tc>
+      </w:tr>
+      <w:tr>
+        <w:tc>
+          <w:tcPr>
+            <w:tcW w:type="dxa" w:w="3685"/>
+          </w:tcPr>
+          <w:p>
+            <w:r/>
+            <w:r>
+              <w:rPr>
+                <w:sz w:val="18"/>
+              </w:rPr>
+              <w:t>Plateformes individuelles roulantes (PIR)</w:t>
+            </w:r>
+          </w:p>
+        </w:tc>
+        <w:tc>
+          <w:tcPr>
+            <w:tcW w:type="dxa" w:w="4819"/>
+          </w:tcPr>
+          <w:p>
+            <w:r/>
+            <w:r>
+              <w:rPr>
+                <w:sz w:val="18"/>
+              </w:rPr>
+              <w:t>Travail en hauteur sécurisé sous plafond, poste par poste</w:t>
+            </w:r>
+          </w:p>
+        </w:tc>
+      </w:tr>
+      <w:tr>
+        <w:tc>
+          <w:tcPr>
+            <w:tcW w:type="dxa" w:w="3685"/>
+          </w:tcPr>
+          <w:p>
+            <w:r/>
+            <w:r>
+              <w:rPr>
+                <w:sz w:val="18"/>
+              </w:rPr>
+              <w:t>Escabeaux et échelles télescopiques</w:t>
+            </w:r>
+          </w:p>
+        </w:tc>
+        <w:tc>
+          <w:tcPr>
+            <w:tcW w:type="dxa" w:w="4819"/>
+          </w:tcPr>
+          <w:p>
+            <w:r/>
+            <w:r>
+              <w:rPr>
+                <w:sz w:val="18"/>
+              </w:rPr>
+              <w:t>Interventions ponctuelles et retouches localisées</w:t>
+            </w:r>
+          </w:p>
+        </w:tc>
+      </w:tr>
+      <w:tr>
+        <w:tc>
+          <w:tcPr>
+            <w:tcW w:type="dxa" w:w="3685"/>
+          </w:tcPr>
+          <w:p>
+            <w:r/>
+            <w:r>
+              <w:rPr>
+                <w:sz w:val="18"/>
+              </w:rPr>
+              <w:t>Règle de contrôle 2 mètres et niveau à bulle</w:t>
+            </w:r>
+          </w:p>
+        </w:tc>
+        <w:tc>
+          <w:tcPr>
+            <w:tcW w:type="dxa" w:w="4819"/>
+          </w:tcPr>
+          <w:p>
+            <w:r/>
+            <w:r>
+              <w:rPr>
+                <w:sz w:val="18"/>
+              </w:rPr>
+              <w:t>Vérification de la planéité de la sous-face (tolérance 3 mm)</w:t>
+            </w:r>
+          </w:p>
+        </w:tc>
+      </w:tr>
+      <w:tr>
+        <w:tc>
+          <w:tcPr>
+            <w:tcW w:type="dxa" w:w="3685"/>
+          </w:tcPr>
+          <w:p>
+            <w:r/>
+            <w:r>
+              <w:rPr>
+                <w:sz w:val="18"/>
+              </w:rPr>
+              <w:t>Chariot / diable de manutention</w:t>
+            </w:r>
+          </w:p>
+        </w:tc>
+        <w:tc>
+          <w:tcPr>
+            <w:tcW w:type="dxa" w:w="4819"/>
+          </w:tcPr>
+          <w:p>
+            <w:r/>
+            <w:r>
+              <w:rPr>
+                <w:sz w:val="18"/>
+              </w:rPr>
+              <w:t>Transport des dalles et profilés depuis la zone de stockage jusqu'au poste de pose</w:t>
+            </w:r>
+          </w:p>
+        </w:tc>
+      </w:tr>
+      <w:tr>
+        <w:tc>
+          <w:tcPr>
+            <w:tcW w:type="dxa" w:w="3685"/>
+          </w:tcPr>
+          <w:p>
+            <w:r/>
+            <w:r>
+              <w:rPr>
+                <w:sz w:val="18"/>
+              </w:rPr>
+              <w:t>Gants de manutention et lunettes de protection</w:t>
+            </w:r>
+          </w:p>
+        </w:tc>
+        <w:tc>
+          <w:tcPr>
+            <w:tcW w:type="dxa" w:w="4819"/>
+          </w:tcPr>
+          <w:p>
+            <w:r/>
+            <w:r>
+              <w:rPr>
+                <w:sz w:val="18"/>
+              </w:rPr>
+              <w:t>Manipulation des dalles minérales et découpes</w:t>
+            </w:r>
+          </w:p>
+        </w:tc>
+      </w:tr>
+      <w:tr>
+        <w:tc>
+          <w:tcPr>
+            <w:tcW w:type="dxa" w:w="3685"/>
+          </w:tcPr>
+          <w:p>
+            <w:r/>
+            <w:r>
+              <w:rPr>
+                <w:sz w:val="18"/>
+              </w:rPr>
+              <w:t>Aspirateur portatif</w:t>
+            </w:r>
+          </w:p>
+        </w:tc>
+        <w:tc>
+          <w:tcPr>
+            <w:tcW w:type="dxa" w:w="4819"/>
+          </w:tcPr>
+          <w:p>
+            <w:r/>
+            <w:r>
+              <w:rPr>
+                <w:sz w:val="18"/>
+              </w:rPr>
+              <w:t>Nettoyage de précision des ouvrages terminés (trappes, luminaires, quincailleries)</w:t>
+            </w:r>
+          </w:p>
+        </w:tc>
+      </w:tr>
+      <w:tr>
+        <w:tc>
+          <w:tcPr>
+            <w:tcW w:type="dxa" w:w="3685"/>
+          </w:tcPr>
+          <w:p>
+            <w:r/>
+            <w:r>
+              <w:rPr>
+                <w:sz w:val="18"/>
+              </w:rPr>
+              <w:t>Boîte à outils manuels (marteaux, tenailles, pinces, mètres)</w:t>
+            </w:r>
+          </w:p>
+        </w:tc>
+        <w:tc>
+          <w:tcPr>
+            <w:tcW w:type="dxa" w:w="4819"/>
+          </w:tcPr>
+          <w:p>
+            <w:r/>
+            <w:r>
+              <w:rPr>
+                <w:sz w:val="18"/>
+              </w:rPr>
+              <w:t>Ajustements courants sur l'ensemble des opérations de pose</w:t>
             </w:r>
           </w:p>
         </w:tc>
@@ -3090,7 +3916,7 @@
           <w:i/>
           <w:sz w:val="21"/>
         </w:rPr>
-        <w:t>Matériels mobilisés par l'équipe Syed Asmatullah / Sian Muhammad.</w:t>
+        <w:t>Matériels mobilisés par l'équipe Syed Asmatullah / Sian Muhammad, pour la mise en œuvre des systèmes Indeko Bio Fix/Satin (Caparol) et Muroprim/Garnysatin S2P (Seigneurie).</w:t>
       </w:r>
     </w:p>
     <w:tbl>
@@ -3107,7 +3933,7 @@
       <w:tr>
         <w:tc>
           <w:tcPr>
-            <w:tcW w:type="dxa" w:w="3402"/>
+            <w:tcW w:type="dxa" w:w="3685"/>
             <w:shd w:val="clear" w:color="auto" w:fill="2E74B5"/>
           </w:tcPr>
           <w:p>
@@ -3124,7 +3950,7 @@
         </w:tc>
         <w:tc>
           <w:tcPr>
-            <w:tcW w:type="dxa" w:w="5102"/>
+            <w:tcW w:type="dxa" w:w="4819"/>
             <w:shd w:val="clear" w:color="auto" w:fill="2E74B5"/>
           </w:tcPr>
           <w:p>
@@ -3143,29 +3969,29 @@
       <w:tr>
         <w:tc>
           <w:tcPr>
-            <w:tcW w:type="dxa" w:w="3402"/>
-          </w:tcPr>
-          <w:p>
-            <w:r/>
-            <w:r>
-              <w:rPr>
-                <w:sz w:val="18"/>
-              </w:rPr>
-              <w:t>Ponceuses avec aspiration intégrée</w:t>
-            </w:r>
-          </w:p>
-        </w:tc>
-        <w:tc>
-          <w:tcPr>
-            <w:tcW w:type="dxa" w:w="5102"/>
-          </w:tcPr>
-          <w:p>
-            <w:r/>
-            <w:r>
-              <w:rPr>
-                <w:sz w:val="18"/>
-              </w:rPr>
-              <w:t>Préparation des supports sans dispersion de poussières</w:t>
+            <w:tcW w:type="dxa" w:w="3685"/>
+          </w:tcPr>
+          <w:p>
+            <w:r/>
+            <w:r>
+              <w:rPr>
+                <w:sz w:val="18"/>
+              </w:rPr>
+              <w:t>Ponceuses électriques avec aspiration intégrée</w:t>
+            </w:r>
+          </w:p>
+        </w:tc>
+        <w:tc>
+          <w:tcPr>
+            <w:tcW w:type="dxa" w:w="4819"/>
+          </w:tcPr>
+          <w:p>
+            <w:r/>
+            <w:r>
+              <w:rPr>
+                <w:sz w:val="18"/>
+              </w:rPr>
+              <w:t>Préparation des supports (égrenage, ponçage) sans dispersion de poussières</w:t>
             </w:r>
           </w:p>
         </w:tc>
@@ -3173,29 +3999,29 @@
       <w:tr>
         <w:tc>
           <w:tcPr>
-            <w:tcW w:type="dxa" w:w="3402"/>
-          </w:tcPr>
-          <w:p>
-            <w:r/>
-            <w:r>
-              <w:rPr>
-                <w:sz w:val="18"/>
-              </w:rPr>
-              <w:t>Rouleaux, brosses et pistolets d'application</w:t>
-            </w:r>
-          </w:p>
-        </w:tc>
-        <w:tc>
-          <w:tcPr>
-            <w:tcW w:type="dxa" w:w="5102"/>
-          </w:tcPr>
-          <w:p>
-            <w:r/>
-            <w:r>
-              <w:rPr>
-                <w:sz w:val="18"/>
-              </w:rPr>
-              <w:t>Application des impressions et finitions</w:t>
+            <w:tcW w:type="dxa" w:w="3685"/>
+          </w:tcPr>
+          <w:p>
+            <w:r/>
+            <w:r>
+              <w:rPr>
+                <w:sz w:val="18"/>
+              </w:rPr>
+              <w:t>Ponceuse girafe (perche télescopique)</w:t>
+            </w:r>
+          </w:p>
+        </w:tc>
+        <w:tc>
+          <w:tcPr>
+            <w:tcW w:type="dxa" w:w="4819"/>
+          </w:tcPr>
+          <w:p>
+            <w:r/>
+            <w:r>
+              <w:rPr>
+                <w:sz w:val="18"/>
+              </w:rPr>
+              <w:t>Ponçage des plafonds et parties hautes sans échafaudage</w:t>
             </w:r>
           </w:p>
         </w:tc>
@@ -3203,29 +4029,29 @@
       <w:tr>
         <w:tc>
           <w:tcPr>
-            <w:tcW w:type="dxa" w:w="3402"/>
-          </w:tcPr>
-          <w:p>
-            <w:r/>
-            <w:r>
-              <w:rPr>
-                <w:sz w:val="18"/>
-              </w:rPr>
-              <w:t>Bâches et films de protection</w:t>
-            </w:r>
-          </w:p>
-        </w:tc>
-        <w:tc>
-          <w:tcPr>
-            <w:tcW w:type="dxa" w:w="5102"/>
-          </w:tcPr>
-          <w:p>
-            <w:r/>
-            <w:r>
-              <w:rPr>
-                <w:sz w:val="18"/>
-              </w:rPr>
-              <w:t>Protection des sols et ouvrages voisins pendant l'application</w:t>
+            <w:tcW w:type="dxa" w:w="3685"/>
+          </w:tcPr>
+          <w:p>
+            <w:r/>
+            <w:r>
+              <w:rPr>
+                <w:sz w:val="18"/>
+              </w:rPr>
+              <w:t>Spatules, couteaux à enduire et taloches</w:t>
+            </w:r>
+          </w:p>
+        </w:tc>
+        <w:tc>
+          <w:tcPr>
+            <w:tcW w:type="dxa" w:w="4819"/>
+          </w:tcPr>
+          <w:p>
+            <w:r/>
+            <w:r>
+              <w:rPr>
+                <w:sz w:val="18"/>
+              </w:rPr>
+              <w:t>Application des enduits de rebouchage et de ratissage (Bagar Airliss G/F)</w:t>
             </w:r>
           </w:p>
         </w:tc>
@@ -3233,29 +4059,29 @@
       <w:tr>
         <w:tc>
           <w:tcPr>
-            <w:tcW w:type="dxa" w:w="3402"/>
-          </w:tcPr>
-          <w:p>
-            <w:r/>
-            <w:r>
-              <w:rPr>
-                <w:sz w:val="18"/>
-              </w:rPr>
-              <w:t>Échelles et escabeaux adaptés</w:t>
-            </w:r>
-          </w:p>
-        </w:tc>
-        <w:tc>
-          <w:tcPr>
-            <w:tcW w:type="dxa" w:w="5102"/>
-          </w:tcPr>
-          <w:p>
-            <w:r/>
-            <w:r>
-              <w:rPr>
-                <w:sz w:val="18"/>
-              </w:rPr>
-              <w:t>Accès aux parties hautes en complément des plateformes</w:t>
+            <w:tcW w:type="dxa" w:w="3685"/>
+          </w:tcPr>
+          <w:p>
+            <w:r/>
+            <w:r>
+              <w:rPr>
+                <w:sz w:val="18"/>
+              </w:rPr>
+              <w:t>Rouleaux (laqueurs, façade), brosses et pinceaux assortis</w:t>
+            </w:r>
+          </w:p>
+        </w:tc>
+        <w:tc>
+          <w:tcPr>
+            <w:tcW w:type="dxa" w:w="4819"/>
+          </w:tcPr>
+          <w:p>
+            <w:r/>
+            <w:r>
+              <w:rPr>
+                <w:sz w:val="18"/>
+              </w:rPr>
+              <w:t>Application manuelle des impressions et finitions selon le support</w:t>
             </w:r>
           </w:p>
         </w:tc>
@@ -3263,29 +4089,269 @@
       <w:tr>
         <w:tc>
           <w:tcPr>
-            <w:tcW w:type="dxa" w:w="3402"/>
-          </w:tcPr>
-          <w:p>
-            <w:r/>
-            <w:r>
-              <w:rPr>
-                <w:sz w:val="18"/>
-              </w:rPr>
-              <w:t>Matériel de nettoyage des outils</w:t>
-            </w:r>
-          </w:p>
-        </w:tc>
-        <w:tc>
-          <w:tcPr>
-            <w:tcW w:type="dxa" w:w="5102"/>
-          </w:tcPr>
-          <w:p>
-            <w:r/>
-            <w:r>
-              <w:rPr>
-                <w:sz w:val="18"/>
-              </w:rPr>
-              <w:t>Entretien du matériel entre chaque teinte/produit</w:t>
+            <w:tcW w:type="dxa" w:w="3685"/>
+          </w:tcPr>
+          <w:p>
+            <w:r/>
+            <w:r>
+              <w:rPr>
+                <w:sz w:val="18"/>
+              </w:rPr>
+              <w:t>Pistolet à peinture airless (projection mécanisée)</w:t>
+            </w:r>
+          </w:p>
+        </w:tc>
+        <w:tc>
+          <w:tcPr>
+            <w:tcW w:type="dxa" w:w="4819"/>
+          </w:tcPr>
+          <w:p>
+            <w:r/>
+            <w:r>
+              <w:rPr>
+                <w:sz w:val="18"/>
+              </w:rPr>
+              <w:t>Application mécanisée sur grandes surfaces (murs, plafonds) pour homogénéité et rendement</w:t>
+            </w:r>
+          </w:p>
+        </w:tc>
+      </w:tr>
+      <w:tr>
+        <w:tc>
+          <w:tcPr>
+            <w:tcW w:type="dxa" w:w="3685"/>
+          </w:tcPr>
+          <w:p>
+            <w:r/>
+            <w:r>
+              <w:rPr>
+                <w:sz w:val="18"/>
+              </w:rPr>
+              <w:t>Bacs, grilles d'essorage et seaux de transvasement</w:t>
+            </w:r>
+          </w:p>
+        </w:tc>
+        <w:tc>
+          <w:tcPr>
+            <w:tcW w:type="dxa" w:w="4819"/>
+          </w:tcPr>
+          <w:p>
+            <w:r/>
+            <w:r>
+              <w:rPr>
+                <w:sz w:val="18"/>
+              </w:rPr>
+              <w:t>Préparation et dosage des peintures et impressions</w:t>
+            </w:r>
+          </w:p>
+        </w:tc>
+      </w:tr>
+      <w:tr>
+        <w:tc>
+          <w:tcPr>
+            <w:tcW w:type="dxa" w:w="3685"/>
+          </w:tcPr>
+          <w:p>
+            <w:r/>
+            <w:r>
+              <w:rPr>
+                <w:sz w:val="18"/>
+              </w:rPr>
+              <w:t>Rubans de masquage et adhésifs de précision</w:t>
+            </w:r>
+          </w:p>
+        </w:tc>
+        <w:tc>
+          <w:tcPr>
+            <w:tcW w:type="dxa" w:w="4819"/>
+          </w:tcPr>
+          <w:p>
+            <w:r/>
+            <w:r>
+              <w:rPr>
+                <w:sz w:val="18"/>
+              </w:rPr>
+              <w:t>Protection des arêtes, huisseries et éléments non peints</w:t>
+            </w:r>
+          </w:p>
+        </w:tc>
+      </w:tr>
+      <w:tr>
+        <w:tc>
+          <w:tcPr>
+            <w:tcW w:type="dxa" w:w="3685"/>
+          </w:tcPr>
+          <w:p>
+            <w:r/>
+            <w:r>
+              <w:rPr>
+                <w:sz w:val="18"/>
+              </w:rPr>
+              <w:t>Bâches et films de protection</w:t>
+            </w:r>
+          </w:p>
+        </w:tc>
+        <w:tc>
+          <w:tcPr>
+            <w:tcW w:type="dxa" w:w="4819"/>
+          </w:tcPr>
+          <w:p>
+            <w:r/>
+            <w:r>
+              <w:rPr>
+                <w:sz w:val="18"/>
+              </w:rPr>
+              <w:t>Protection des sols et ouvrages voisins pendant l'application</w:t>
+            </w:r>
+          </w:p>
+        </w:tc>
+      </w:tr>
+      <w:tr>
+        <w:tc>
+          <w:tcPr>
+            <w:tcW w:type="dxa" w:w="3685"/>
+          </w:tcPr>
+          <w:p>
+            <w:r/>
+            <w:r>
+              <w:rPr>
+                <w:sz w:val="18"/>
+              </w:rPr>
+              <w:t>Échelles, escabeaux et plateformes individuelles roulantes</w:t>
+            </w:r>
+          </w:p>
+        </w:tc>
+        <w:tc>
+          <w:tcPr>
+            <w:tcW w:type="dxa" w:w="4819"/>
+          </w:tcPr>
+          <w:p>
+            <w:r/>
+            <w:r>
+              <w:rPr>
+                <w:sz w:val="18"/>
+              </w:rPr>
+              <w:t>Accès aux parties hautes en complément des échafaudages</w:t>
+            </w:r>
+          </w:p>
+        </w:tc>
+      </w:tr>
+      <w:tr>
+        <w:tc>
+          <w:tcPr>
+            <w:tcW w:type="dxa" w:w="3685"/>
+          </w:tcPr>
+          <w:p>
+            <w:r/>
+            <w:r>
+              <w:rPr>
+                <w:sz w:val="18"/>
+              </w:rPr>
+              <w:t>Humidimètre et thermo-hygromètre d'ambiance</w:t>
+            </w:r>
+          </w:p>
+        </w:tc>
+        <w:tc>
+          <w:tcPr>
+            <w:tcW w:type="dxa" w:w="4819"/>
+          </w:tcPr>
+          <w:p>
+            <w:r/>
+            <w:r>
+              <w:rPr>
+                <w:sz w:val="18"/>
+              </w:rPr>
+              <w:t>Contrôle des conditions de support et d'application (température, hygrométrie) avant mise en peinture</w:t>
+            </w:r>
+          </w:p>
+        </w:tc>
+      </w:tr>
+      <w:tr>
+        <w:tc>
+          <w:tcPr>
+            <w:tcW w:type="dxa" w:w="3685"/>
+          </w:tcPr>
+          <w:p>
+            <w:r/>
+            <w:r>
+              <w:rPr>
+                <w:sz w:val="18"/>
+              </w:rPr>
+              <w:t>Cutters, couteaux de peintre et racloirs</w:t>
+            </w:r>
+          </w:p>
+        </w:tc>
+        <w:tc>
+          <w:tcPr>
+            <w:tcW w:type="dxa" w:w="4819"/>
+          </w:tcPr>
+          <w:p>
+            <w:r/>
+            <w:r>
+              <w:rPr>
+                <w:sz w:val="18"/>
+              </w:rPr>
+              <w:t>Préparation des supports et finitions de détail</w:t>
+            </w:r>
+          </w:p>
+        </w:tc>
+      </w:tr>
+      <w:tr>
+        <w:tc>
+          <w:tcPr>
+            <w:tcW w:type="dxa" w:w="3685"/>
+          </w:tcPr>
+          <w:p>
+            <w:r/>
+            <w:r>
+              <w:rPr>
+                <w:sz w:val="18"/>
+              </w:rPr>
+              <w:t>Matériel de nettoyage des outils (bacs, brosses à peinture)</w:t>
+            </w:r>
+          </w:p>
+        </w:tc>
+        <w:tc>
+          <w:tcPr>
+            <w:tcW w:type="dxa" w:w="4819"/>
+          </w:tcPr>
+          <w:p>
+            <w:r/>
+            <w:r>
+              <w:rPr>
+                <w:sz w:val="18"/>
+              </w:rPr>
+              <w:t>Entretien du matériel entre chaque teinte ou produit, sans rejet de solvants</w:t>
+            </w:r>
+          </w:p>
+        </w:tc>
+      </w:tr>
+      <w:tr>
+        <w:tc>
+          <w:tcPr>
+            <w:tcW w:type="dxa" w:w="3685"/>
+          </w:tcPr>
+          <w:p>
+            <w:r/>
+            <w:r>
+              <w:rPr>
+                <w:sz w:val="18"/>
+              </w:rPr>
+              <w:t>Aspirateur/extracteur d'air portatif</w:t>
+            </w:r>
+          </w:p>
+        </w:tc>
+        <w:tc>
+          <w:tcPr>
+            <w:tcW w:type="dxa" w:w="4819"/>
+          </w:tcPr>
+          <w:p>
+            <w:r/>
+            <w:r>
+              <w:rPr>
+                <w:sz w:val="18"/>
+              </w:rPr>
+              <w:t>Évacuation des vapeurs et odeurs lors de l'application, en complément du confinement de zone</w:t>
             </w:r>
           </w:p>
         </w:tc>
@@ -3312,7 +4378,7 @@
           <w:i/>
           <w:sz w:val="21"/>
         </w:rPr>
-        <w:t>Matériels mobilisés par l'équipe Gul Ajab / Diarra Souleymane.</w:t>
+        <w:t>Matériels mobilisés par l'équipe Gul Ajab / Diarra Souleymane, pour la pose des revêtements Taralay Impression Compact 43 et Mipolam Planet (Gerflor).</w:t>
       </w:r>
     </w:p>
     <w:tbl>
@@ -3329,7 +4395,7 @@
       <w:tr>
         <w:tc>
           <w:tcPr>
-            <w:tcW w:type="dxa" w:w="3402"/>
+            <w:tcW w:type="dxa" w:w="3685"/>
             <w:shd w:val="clear" w:color="auto" w:fill="2E74B5"/>
           </w:tcPr>
           <w:p>
@@ -3346,7 +4412,7 @@
         </w:tc>
         <w:tc>
           <w:tcPr>
-            <w:tcW w:type="dxa" w:w="5102"/>
+            <w:tcW w:type="dxa" w:w="4819"/>
             <w:shd w:val="clear" w:color="auto" w:fill="2E74B5"/>
           </w:tcPr>
           <w:p>
@@ -3365,29 +4431,29 @@
       <w:tr>
         <w:tc>
           <w:tcPr>
-            <w:tcW w:type="dxa" w:w="3402"/>
-          </w:tcPr>
-          <w:p>
-            <w:r/>
-            <w:r>
-              <w:rPr>
-                <w:sz w:val="18"/>
-              </w:rPr>
-              <w:t>Ponceuse / lisseuse de sol</w:t>
-            </w:r>
-          </w:p>
-        </w:tc>
-        <w:tc>
-          <w:tcPr>
-            <w:tcW w:type="dxa" w:w="5102"/>
-          </w:tcPr>
-          <w:p>
-            <w:r/>
-            <w:r>
-              <w:rPr>
-                <w:sz w:val="18"/>
-              </w:rPr>
-              <w:t>Préparation et ragréage des supports</w:t>
+            <w:tcW w:type="dxa" w:w="3685"/>
+          </w:tcPr>
+          <w:p>
+            <w:r/>
+            <w:r>
+              <w:rPr>
+                <w:sz w:val="18"/>
+              </w:rPr>
+              <w:t>Ponceuse de sol à disque</w:t>
+            </w:r>
+          </w:p>
+        </w:tc>
+        <w:tc>
+          <w:tcPr>
+            <w:tcW w:type="dxa" w:w="4819"/>
+          </w:tcPr>
+          <w:p>
+            <w:r/>
+            <w:r>
+              <w:rPr>
+                <w:sz w:val="18"/>
+              </w:rPr>
+              <w:t>Préparation mécanique des supports avant ragréage</w:t>
             </w:r>
           </w:p>
         </w:tc>
@@ -3395,29 +4461,29 @@
       <w:tr>
         <w:tc>
           <w:tcPr>
-            <w:tcW w:type="dxa" w:w="3402"/>
-          </w:tcPr>
-          <w:p>
-            <w:r/>
-            <w:r>
-              <w:rPr>
-                <w:sz w:val="18"/>
-              </w:rPr>
-              <w:t>Humidimètre</w:t>
-            </w:r>
-          </w:p>
-        </w:tc>
-        <w:tc>
-          <w:tcPr>
-            <w:tcW w:type="dxa" w:w="5102"/>
-          </w:tcPr>
-          <w:p>
-            <w:r/>
-            <w:r>
-              <w:rPr>
-                <w:sz w:val="18"/>
-              </w:rPr>
-              <w:t>Contrôle du taux d'humidité des supports avant pose</w:t>
+            <w:tcW w:type="dxa" w:w="3685"/>
+          </w:tcPr>
+          <w:p>
+            <w:r/>
+            <w:r>
+              <w:rPr>
+                <w:sz w:val="18"/>
+              </w:rPr>
+              <w:t>Aspirateur eau/poussière</w:t>
+            </w:r>
+          </w:p>
+        </w:tc>
+        <w:tc>
+          <w:tcPr>
+            <w:tcW w:type="dxa" w:w="4819"/>
+          </w:tcPr>
+          <w:p>
+            <w:r/>
+            <w:r>
+              <w:rPr>
+                <w:sz w:val="18"/>
+              </w:rPr>
+              <w:t>Nettoyage des supports après ponçage, avant application du primaire</w:t>
             </w:r>
           </w:p>
         </w:tc>
@@ -3425,29 +4491,29 @@
       <w:tr>
         <w:tc>
           <w:tcPr>
-            <w:tcW w:type="dxa" w:w="3402"/>
-          </w:tcPr>
-          <w:p>
-            <w:r/>
-            <w:r>
-              <w:rPr>
-                <w:sz w:val="18"/>
-              </w:rPr>
-              <w:t>Spatules crantées et matériel d'encollage</w:t>
-            </w:r>
-          </w:p>
-        </w:tc>
-        <w:tc>
-          <w:tcPr>
-            <w:tcW w:type="dxa" w:w="5102"/>
-          </w:tcPr>
-          <w:p>
-            <w:r/>
-            <w:r>
-              <w:rPr>
-                <w:sz w:val="18"/>
-              </w:rPr>
-              <w:t>Application de la colle</w:t>
+            <w:tcW w:type="dxa" w:w="3685"/>
+          </w:tcPr>
+          <w:p>
+            <w:r/>
+            <w:r>
+              <w:rPr>
+                <w:sz w:val="18"/>
+              </w:rPr>
+              <w:t>Malaxeur électrique et seaux gradués</w:t>
+            </w:r>
+          </w:p>
+        </w:tc>
+        <w:tc>
+          <w:tcPr>
+            <w:tcW w:type="dxa" w:w="4819"/>
+          </w:tcPr>
+          <w:p>
+            <w:r/>
+            <w:r>
+              <w:rPr>
+                <w:sz w:val="18"/>
+              </w:rPr>
+              <w:t>Gâchage du primaire d'accrochage (Weberprim RP) et de l'enduit de lissage (Weberniv Dur+)</w:t>
             </w:r>
           </w:p>
         </w:tc>
@@ -3455,29 +4521,29 @@
       <w:tr>
         <w:tc>
           <w:tcPr>
-            <w:tcW w:type="dxa" w:w="3402"/>
-          </w:tcPr>
-          <w:p>
-            <w:r/>
-            <w:r>
-              <w:rPr>
-                <w:sz w:val="18"/>
-              </w:rPr>
-              <w:t>Rouleau presseur / maroufleur</w:t>
-            </w:r>
-          </w:p>
-        </w:tc>
-        <w:tc>
-          <w:tcPr>
-            <w:tcW w:type="dxa" w:w="5102"/>
-          </w:tcPr>
-          <w:p>
-            <w:r/>
-            <w:r>
-              <w:rPr>
-                <w:sz w:val="18"/>
-              </w:rPr>
-              <w:t>Marouflage des lés pour une adhérence parfaite</w:t>
+            <w:tcW w:type="dxa" w:w="3685"/>
+          </w:tcPr>
+          <w:p>
+            <w:r/>
+            <w:r>
+              <w:rPr>
+                <w:sz w:val="18"/>
+              </w:rPr>
+              <w:t>Règle de tirage et taloche lisseuse</w:t>
+            </w:r>
+          </w:p>
+        </w:tc>
+        <w:tc>
+          <w:tcPr>
+            <w:tcW w:type="dxa" w:w="4819"/>
+          </w:tcPr>
+          <w:p>
+            <w:r/>
+            <w:r>
+              <w:rPr>
+                <w:sz w:val="18"/>
+              </w:rPr>
+              <w:t>Application et nivellement de l'enduit de ragréage</w:t>
             </w:r>
           </w:p>
         </w:tc>
@@ -3485,29 +4551,29 @@
       <w:tr>
         <w:tc>
           <w:tcPr>
-            <w:tcW w:type="dxa" w:w="3402"/>
-          </w:tcPr>
-          <w:p>
-            <w:r/>
-            <w:r>
-              <w:rPr>
-                <w:sz w:val="18"/>
-              </w:rPr>
-              <w:t>Cutters et guides de coupe</w:t>
-            </w:r>
-          </w:p>
-        </w:tc>
-        <w:tc>
-          <w:tcPr>
-            <w:tcW w:type="dxa" w:w="5102"/>
-          </w:tcPr>
-          <w:p>
-            <w:r/>
-            <w:r>
-              <w:rPr>
-                <w:sz w:val="18"/>
-              </w:rPr>
-              <w:t>Découpes précises et ajustements en périphérie</w:t>
+            <w:tcW w:type="dxa" w:w="3685"/>
+          </w:tcPr>
+          <w:p>
+            <w:r/>
+            <w:r>
+              <w:rPr>
+                <w:sz w:val="18"/>
+              </w:rPr>
+              <w:t>Humidimètre</w:t>
+            </w:r>
+          </w:p>
+        </w:tc>
+        <w:tc>
+          <w:tcPr>
+            <w:tcW w:type="dxa" w:w="4819"/>
+          </w:tcPr>
+          <w:p>
+            <w:r/>
+            <w:r>
+              <w:rPr>
+                <w:sz w:val="18"/>
+              </w:rPr>
+              <w:t>Contrôle du taux d'humidité des supports avant pose, y compris après réception du renfort structurel en zone scanner</w:t>
             </w:r>
           </w:p>
         </w:tc>
@@ -3515,7 +4581,157 @@
       <w:tr>
         <w:tc>
           <w:tcPr>
-            <w:tcW w:type="dxa" w:w="3402"/>
+            <w:tcW w:type="dxa" w:w="3685"/>
+          </w:tcPr>
+          <w:p>
+            <w:r/>
+            <w:r>
+              <w:rPr>
+                <w:sz w:val="18"/>
+              </w:rPr>
+              <w:t>Spatules crantées (dentelure adaptée au revêtement)</w:t>
+            </w:r>
+          </w:p>
+        </w:tc>
+        <w:tc>
+          <w:tcPr>
+            <w:tcW w:type="dxa" w:w="4819"/>
+          </w:tcPr>
+          <w:p>
+            <w:r/>
+            <w:r>
+              <w:rPr>
+                <w:sz w:val="18"/>
+              </w:rPr>
+              <w:t>Application de la colle Uzin KE 2000S</w:t>
+            </w:r>
+          </w:p>
+        </w:tc>
+      </w:tr>
+      <w:tr>
+        <w:tc>
+          <w:tcPr>
+            <w:tcW w:type="dxa" w:w="3685"/>
+          </w:tcPr>
+          <w:p>
+            <w:r/>
+            <w:r>
+              <w:rPr>
+                <w:sz w:val="18"/>
+              </w:rPr>
+              <w:t>Rouleau presseur lourd et maroufleur manuel</w:t>
+            </w:r>
+          </w:p>
+        </w:tc>
+        <w:tc>
+          <w:tcPr>
+            <w:tcW w:type="dxa" w:w="4819"/>
+          </w:tcPr>
+          <w:p>
+            <w:r/>
+            <w:r>
+              <w:rPr>
+                <w:sz w:val="18"/>
+              </w:rPr>
+              <w:t>Marouflage des lés pour chasser l'air et garantir une adhérence parfaite</w:t>
+            </w:r>
+          </w:p>
+        </w:tc>
+      </w:tr>
+      <w:tr>
+        <w:tc>
+          <w:tcPr>
+            <w:tcW w:type="dxa" w:w="3685"/>
+          </w:tcPr>
+          <w:p>
+            <w:r/>
+            <w:r>
+              <w:rPr>
+                <w:sz w:val="18"/>
+              </w:rPr>
+              <w:t>Rouleau anti-bulles</w:t>
+            </w:r>
+          </w:p>
+        </w:tc>
+        <w:tc>
+          <w:tcPr>
+            <w:tcW w:type="dxa" w:w="4819"/>
+          </w:tcPr>
+          <w:p>
+            <w:r/>
+            <w:r>
+              <w:rPr>
+                <w:sz w:val="18"/>
+              </w:rPr>
+              <w:t>Finition du marouflage sur les grandes surfaces</w:t>
+            </w:r>
+          </w:p>
+        </w:tc>
+      </w:tr>
+      <w:tr>
+        <w:tc>
+          <w:tcPr>
+            <w:tcW w:type="dxa" w:w="3685"/>
+          </w:tcPr>
+          <w:p>
+            <w:r/>
+            <w:r>
+              <w:rPr>
+                <w:sz w:val="18"/>
+              </w:rPr>
+              <w:t>Cutters à crochet et guides de coupe métalliques</w:t>
+            </w:r>
+          </w:p>
+        </w:tc>
+        <w:tc>
+          <w:tcPr>
+            <w:tcW w:type="dxa" w:w="4819"/>
+          </w:tcPr>
+          <w:p>
+            <w:r/>
+            <w:r>
+              <w:rPr>
+                <w:sz w:val="18"/>
+              </w:rPr>
+              <w:t>Découpes précises et ajustements en périphérie et autour des réservations</w:t>
+            </w:r>
+          </w:p>
+        </w:tc>
+      </w:tr>
+      <w:tr>
+        <w:tc>
+          <w:tcPr>
+            <w:tcW w:type="dxa" w:w="3685"/>
+          </w:tcPr>
+          <w:p>
+            <w:r/>
+            <w:r>
+              <w:rPr>
+                <w:sz w:val="18"/>
+              </w:rPr>
+              <w:t>Compas de traçage</w:t>
+            </w:r>
+          </w:p>
+        </w:tc>
+        <w:tc>
+          <w:tcPr>
+            <w:tcW w:type="dxa" w:w="4819"/>
+          </w:tcPr>
+          <w:p>
+            <w:r/>
+            <w:r>
+              <w:rPr>
+                <w:sz w:val="18"/>
+              </w:rPr>
+              <w:t>Report des découpes complexes (angles, tuyauteries, seuils)</w:t>
+            </w:r>
+          </w:p>
+        </w:tc>
+      </w:tr>
+      <w:tr>
+        <w:tc>
+          <w:tcPr>
+            <w:tcW w:type="dxa" w:w="3685"/>
           </w:tcPr>
           <w:p>
             <w:r/>
@@ -3529,15 +4745,105 @@
         </w:tc>
         <w:tc>
           <w:tcPr>
-            <w:tcW w:type="dxa" w:w="5102"/>
-          </w:tcPr>
-          <w:p>
-            <w:r/>
-            <w:r>
-              <w:rPr>
-                <w:sz w:val="18"/>
-              </w:rPr>
-              <w:t>Traitement des joints entre lés, conformément à la pratique de Gul Ajab et Diarra Souleymane</w:t>
+            <w:tcW w:type="dxa" w:w="4819"/>
+          </w:tcPr>
+          <w:p>
+            <w:r/>
+            <w:r>
+              <w:rPr>
+                <w:sz w:val="18"/>
+              </w:rPr>
+              <w:t>Traitement étanche des joints entre lés, conformément à la pratique de Gul Ajab et Diarra Souleymane</w:t>
+            </w:r>
+          </w:p>
+        </w:tc>
+      </w:tr>
+      <w:tr>
+        <w:tc>
+          <w:tcPr>
+            <w:tcW w:type="dxa" w:w="3685"/>
+          </w:tcPr>
+          <w:p>
+            <w:r/>
+            <w:r>
+              <w:rPr>
+                <w:sz w:val="18"/>
+              </w:rPr>
+              <w:t>Arase-joint / grattoir à cordon</w:t>
+            </w:r>
+          </w:p>
+        </w:tc>
+        <w:tc>
+          <w:tcPr>
+            <w:tcW w:type="dxa" w:w="4819"/>
+          </w:tcPr>
+          <w:p>
+            <w:r/>
+            <w:r>
+              <w:rPr>
+                <w:sz w:val="18"/>
+              </w:rPr>
+              <w:t>Arasage de précision du cordon de soudure à chaud</w:t>
+            </w:r>
+          </w:p>
+        </w:tc>
+      </w:tr>
+      <w:tr>
+        <w:tc>
+          <w:tcPr>
+            <w:tcW w:type="dxa" w:w="3685"/>
+          </w:tcPr>
+          <w:p>
+            <w:r/>
+            <w:r>
+              <w:rPr>
+                <w:sz w:val="18"/>
+              </w:rPr>
+              <w:t>Barre de seuil et outillage de pose (perceuse, chevilles)</w:t>
+            </w:r>
+          </w:p>
+        </w:tc>
+        <w:tc>
+          <w:tcPr>
+            <w:tcW w:type="dxa" w:w="4819"/>
+          </w:tcPr>
+          <w:p>
+            <w:r/>
+            <w:r>
+              <w:rPr>
+                <w:sz w:val="18"/>
+              </w:rPr>
+              <w:t>Fixation des barres de seuil laiton entre revêtements de nature différente</w:t>
+            </w:r>
+          </w:p>
+        </w:tc>
+      </w:tr>
+      <w:tr>
+        <w:tc>
+          <w:tcPr>
+            <w:tcW w:type="dxa" w:w="3685"/>
+          </w:tcPr>
+          <w:p>
+            <w:r/>
+            <w:r>
+              <w:rPr>
+                <w:sz w:val="18"/>
+              </w:rPr>
+              <w:t>Chariot / diable de manutention</w:t>
+            </w:r>
+          </w:p>
+        </w:tc>
+        <w:tc>
+          <w:tcPr>
+            <w:tcW w:type="dxa" w:w="4819"/>
+          </w:tcPr>
+          <w:p>
+            <w:r/>
+            <w:r>
+              <w:rPr>
+                <w:sz w:val="18"/>
+              </w:rPr>
+              <w:t>Transport des rouleaux depuis la zone de stockage jusqu'au poste de pose</w:t>
             </w:r>
           </w:p>
         </w:tc>
@@ -3571,6 +4877,23 @@
       <w:tr>
         <w:tc>
           <w:tcPr>
+            <w:tcW w:type="dxa" w:w="4535"/>
+            <w:shd w:val="clear" w:color="auto" w:fill="2E74B5"/>
+          </w:tcPr>
+          <w:p>
+            <w:r/>
+            <w:r>
+              <w:rPr>
+                <w:b/>
+                <w:color w:val="FFFFFF"/>
+                <w:sz w:val="18"/>
+              </w:rPr>
+              <w:t>Moyen</w:t>
+            </w:r>
+          </w:p>
+        </w:tc>
+        <w:tc>
+          <w:tcPr>
             <w:tcW w:type="dxa" w:w="3969"/>
             <w:shd w:val="clear" w:color="auto" w:fill="2E74B5"/>
           </w:tcPr>
@@ -3582,23 +4905,6 @@
                 <w:color w:val="FFFFFF"/>
                 <w:sz w:val="18"/>
               </w:rPr>
-              <w:t>Moyen</w:t>
-            </w:r>
-          </w:p>
-        </w:tc>
-        <w:tc>
-          <w:tcPr>
-            <w:tcW w:type="dxa" w:w="4535"/>
-            <w:shd w:val="clear" w:color="auto" w:fill="2E74B5"/>
-          </w:tcPr>
-          <w:p>
-            <w:r/>
-            <w:r>
-              <w:rPr>
-                <w:b/>
-                <w:color w:val="FFFFFF"/>
-                <w:sz w:val="18"/>
-              </w:rPr>
               <w:t>Fonction</w:t>
             </w:r>
           </w:p>
@@ -3607,6 +4913,20 @@
       <w:tr>
         <w:tc>
           <w:tcPr>
+            <w:tcW w:type="dxa" w:w="4535"/>
+          </w:tcPr>
+          <w:p>
+            <w:r/>
+            <w:r>
+              <w:rPr>
+                <w:sz w:val="18"/>
+              </w:rPr>
+              <w:t>Aspirateurs de chantier à filtration (classe M/H) sur chaque poste de découpe/ponçage</w:t>
+            </w:r>
+          </w:p>
+        </w:tc>
+        <w:tc>
+          <w:tcPr>
             <w:tcW w:type="dxa" w:w="3969"/>
           </w:tcPr>
           <w:p>
@@ -3615,21 +4935,7 @@
               <w:rPr>
                 <w:sz w:val="18"/>
               </w:rPr>
-              <w:t>Aspirateurs de chantier à filtration (faux plafonds, ponçage peinture)</w:t>
-            </w:r>
-          </w:p>
-        </w:tc>
-        <w:tc>
-          <w:tcPr>
-            <w:tcW w:type="dxa" w:w="4535"/>
-          </w:tcPr>
-          <w:p>
-            <w:r/>
-            <w:r>
-              <w:rPr>
-                <w:sz w:val="18"/>
-              </w:rPr>
-              <w:t>Captage des poussières à la source</w:t>
+              <w:t>Captage des poussières à la source (faux plafonds, ponçage peinture, préparation sols)</w:t>
             </w:r>
           </w:p>
         </w:tc>
@@ -3637,6 +4943,20 @@
       <w:tr>
         <w:tc>
           <w:tcPr>
+            <w:tcW w:type="dxa" w:w="4535"/>
+          </w:tcPr>
+          <w:p>
+            <w:r/>
+            <w:r>
+              <w:rPr>
+                <w:sz w:val="18"/>
+              </w:rPr>
+              <w:t>Extracteurs d'air mobiles avec filtration HEPA</w:t>
+            </w:r>
+          </w:p>
+        </w:tc>
+        <w:tc>
+          <w:tcPr>
             <w:tcW w:type="dxa" w:w="3969"/>
           </w:tcPr>
           <w:p>
@@ -3645,21 +4965,7 @@
               <w:rPr>
                 <w:sz w:val="18"/>
               </w:rPr>
-              <w:t>Confinement de zone (bâches, sas d'accès)</w:t>
-            </w:r>
-          </w:p>
-        </w:tc>
-        <w:tc>
-          <w:tcPr>
-            <w:tcW w:type="dxa" w:w="4535"/>
-          </w:tcPr>
-          <w:p>
-            <w:r/>
-            <w:r>
-              <w:rPr>
-                <w:sz w:val="18"/>
-              </w:rPr>
-              <w:t>Limitation de la propagation des poussières et odeurs hors de l'emprise du chantier</w:t>
+              <w:t>Renouvellement d'air et abattement des particules fines dans la zone confinée</w:t>
             </w:r>
           </w:p>
         </w:tc>
@@ -3667,6 +4973,20 @@
       <w:tr>
         <w:tc>
           <w:tcPr>
+            <w:tcW w:type="dxa" w:w="4535"/>
+          </w:tcPr>
+          <w:p>
+            <w:r/>
+            <w:r>
+              <w:rPr>
+                <w:sz w:val="18"/>
+              </w:rPr>
+              <w:t>Confinement de zone (bâches plastifiées, sas d'accès à double porte)</w:t>
+            </w:r>
+          </w:p>
+        </w:tc>
+        <w:tc>
+          <w:tcPr>
             <w:tcW w:type="dxa" w:w="3969"/>
           </w:tcPr>
           <w:p>
@@ -3675,21 +4995,7 @@
               <w:rPr>
                 <w:sz w:val="18"/>
               </w:rPr>
-              <w:t>Produits à très faible émission de C.O.V.</w:t>
-            </w:r>
-          </w:p>
-        </w:tc>
-        <w:tc>
-          <w:tcPr>
-            <w:tcW w:type="dxa" w:w="4535"/>
-          </w:tcPr>
-          <w:p>
-            <w:r/>
-            <w:r>
-              <w:rPr>
-                <w:sz w:val="18"/>
-              </w:rPr>
-              <w:t>Réduction des nuisances olfactives pour les locaux occupés voisins</w:t>
+              <w:t>Limitation de la propagation des poussières et odeurs hors de l'emprise du chantier</w:t>
             </w:r>
           </w:p>
         </w:tc>
@@ -3697,6 +5003,20 @@
       <w:tr>
         <w:tc>
           <w:tcPr>
+            <w:tcW w:type="dxa" w:w="4535"/>
+          </w:tcPr>
+          <w:p>
+            <w:r/>
+            <w:r>
+              <w:rPr>
+                <w:sz w:val="18"/>
+              </w:rPr>
+              <w:t>Manomètre différentiel de pression</w:t>
+            </w:r>
+          </w:p>
+        </w:tc>
+        <w:tc>
+          <w:tcPr>
             <w:tcW w:type="dxa" w:w="3969"/>
           </w:tcPr>
           <w:p>
@@ -3705,21 +5025,7 @@
               <w:rPr>
                 <w:sz w:val="18"/>
               </w:rPr>
-              <w:t>Équipements de protection individuelle adaptés (masques, gants)</w:t>
-            </w:r>
-          </w:p>
-        </w:tc>
-        <w:tc>
-          <w:tcPr>
-            <w:tcW w:type="dxa" w:w="4535"/>
-          </w:tcPr>
-          <w:p>
-            <w:r/>
-            <w:r>
-              <w:rPr>
-                <w:sz w:val="18"/>
-              </w:rPr>
-              <w:t>Protection du personnel lors des opérations générant poussières ou vapeurs</w:t>
+              <w:t>Contrôle de la mise en dépression de la zone confinée, le cas échéant</w:t>
             </w:r>
           </w:p>
         </w:tc>
@@ -3727,6 +5033,20 @@
       <w:tr>
         <w:tc>
           <w:tcPr>
+            <w:tcW w:type="dxa" w:w="4535"/>
+          </w:tcPr>
+          <w:p>
+            <w:r/>
+            <w:r>
+              <w:rPr>
+                <w:sz w:val="18"/>
+              </w:rPr>
+              <w:t>Produits à très faible émission de C.O.V. (Ecolabel)</w:t>
+            </w:r>
+          </w:p>
+        </w:tc>
+        <w:tc>
+          <w:tcPr>
             <w:tcW w:type="dxa" w:w="3969"/>
           </w:tcPr>
           <w:p>
@@ -3735,10 +5055,12 @@
               <w:rPr>
                 <w:sz w:val="18"/>
               </w:rPr>
-              <w:t>Films et panneaux de protection des sols et circulations</w:t>
-            </w:r>
-          </w:p>
-        </w:tc>
+              <w:t>Réduction des nuisances olfactives pour les locaux occupés voisins</w:t>
+            </w:r>
+          </w:p>
+        </w:tc>
+      </w:tr>
+      <w:tr>
         <w:tc>
           <w:tcPr>
             <w:tcW w:type="dxa" w:w="4535"/>
@@ -3749,7 +5071,171 @@
               <w:rPr>
                 <w:sz w:val="18"/>
               </w:rPr>
+              <w:t>Équipements de protection respiratoire (masques FFP2/FFP3, demi-masques à cartouche)</w:t>
+            </w:r>
+          </w:p>
+        </w:tc>
+        <w:tc>
+          <w:tcPr>
+            <w:tcW w:type="dxa" w:w="3969"/>
+          </w:tcPr>
+          <w:p>
+            <w:r/>
+            <w:r>
+              <w:rPr>
+                <w:sz w:val="18"/>
+              </w:rPr>
+              <w:t>Protection du personnel lors des opérations générant poussières ou vapeurs</w:t>
+            </w:r>
+          </w:p>
+        </w:tc>
+      </w:tr>
+      <w:tr>
+        <w:tc>
+          <w:tcPr>
+            <w:tcW w:type="dxa" w:w="4535"/>
+          </w:tcPr>
+          <w:p>
+            <w:r/>
+            <w:r>
+              <w:rPr>
+                <w:sz w:val="18"/>
+              </w:rPr>
+              <w:t>Gants, lunettes et protections auditives adaptés</w:t>
+            </w:r>
+          </w:p>
+        </w:tc>
+        <w:tc>
+          <w:tcPr>
+            <w:tcW w:type="dxa" w:w="3969"/>
+          </w:tcPr>
+          <w:p>
+            <w:r/>
+            <w:r>
+              <w:rPr>
+                <w:sz w:val="18"/>
+              </w:rPr>
+              <w:t>Protection individuelle selon la nature de l'opération (ponçage, découpe, soudure à chaud)</w:t>
+            </w:r>
+          </w:p>
+        </w:tc>
+      </w:tr>
+      <w:tr>
+        <w:tc>
+          <w:tcPr>
+            <w:tcW w:type="dxa" w:w="4535"/>
+          </w:tcPr>
+          <w:p>
+            <w:r/>
+            <w:r>
+              <w:rPr>
+                <w:sz w:val="18"/>
+              </w:rPr>
+              <w:t>Films et panneaux rigides de protection des sols et circulations</w:t>
+            </w:r>
+          </w:p>
+        </w:tc>
+        <w:tc>
+          <w:tcPr>
+            <w:tcW w:type="dxa" w:w="3969"/>
+          </w:tcPr>
+          <w:p>
+            <w:r/>
+            <w:r>
+              <w:rPr>
+                <w:sz w:val="18"/>
+              </w:rPr>
               <w:t>Limitation des salissures et des dégradations pendant le chantier</w:t>
+            </w:r>
+          </w:p>
+        </w:tc>
+      </w:tr>
+      <w:tr>
+        <w:tc>
+          <w:tcPr>
+            <w:tcW w:type="dxa" w:w="4535"/>
+          </w:tcPr>
+          <w:p>
+            <w:r/>
+            <w:r>
+              <w:rPr>
+                <w:sz w:val="18"/>
+              </w:rPr>
+              <w:t>Housses de protection pour mobilier et équipements fixes</w:t>
+            </w:r>
+          </w:p>
+        </w:tc>
+        <w:tc>
+          <w:tcPr>
+            <w:tcW w:type="dxa" w:w="3969"/>
+          </w:tcPr>
+          <w:p>
+            <w:r/>
+            <w:r>
+              <w:rPr>
+                <w:sz w:val="18"/>
+              </w:rPr>
+              <w:t>Préservation des équipements et mobiliers ne pouvant être déplacés</w:t>
+            </w:r>
+          </w:p>
+        </w:tc>
+      </w:tr>
+      <w:tr>
+        <w:tc>
+          <w:tcPr>
+            <w:tcW w:type="dxa" w:w="4535"/>
+          </w:tcPr>
+          <w:p>
+            <w:r/>
+            <w:r>
+              <w:rPr>
+                <w:sz w:val="18"/>
+              </w:rPr>
+              <w:t>Kit de retrait amiante (combinaisons jetables, sacs à double emballage, aspirateur THE)</w:t>
+            </w:r>
+          </w:p>
+        </w:tc>
+        <w:tc>
+          <w:tcPr>
+            <w:tcW w:type="dxa" w:w="3969"/>
+          </w:tcPr>
+          <w:p>
+            <w:r/>
+            <w:r>
+              <w:rPr>
+                <w:sz w:val="18"/>
+              </w:rPr>
+              <w:t>Procédure sécurisée en cas de découverte de matériaux amiantés lors des dépose d'ouvrages existants</w:t>
+            </w:r>
+          </w:p>
+        </w:tc>
+      </w:tr>
+      <w:tr>
+        <w:tc>
+          <w:tcPr>
+            <w:tcW w:type="dxa" w:w="4535"/>
+          </w:tcPr>
+          <w:p>
+            <w:r/>
+            <w:r>
+              <w:rPr>
+                <w:sz w:val="18"/>
+              </w:rPr>
+              <w:t>Bandes de scellement et rubans de confinement</w:t>
+            </w:r>
+          </w:p>
+        </w:tc>
+        <w:tc>
+          <w:tcPr>
+            <w:tcW w:type="dxa" w:w="3969"/>
+          </w:tcPr>
+          <w:p>
+            <w:r/>
+            <w:r>
+              <w:rPr>
+                <w:sz w:val="18"/>
+              </w:rPr>
+              <w:t>Étanchéité du sas et des points singuliers (gaines, huisseries) pendant les opérations sensibles</w:t>
             </w:r>
           </w:p>
         </w:tc>
@@ -3786,31 +5272,274 @@
           <w:i w:val="0"/>
           <w:sz w:val="21"/>
         </w:rPr>
-        <w:t>Les livraisons de matériaux sont séquencées semaine par semaine selon l'avancement du chantier et directement orientées vers le local de stockage correspondant (cf. § 3.6), sans transit prolongé dans les circulations communes de l'établissement — organisation placée sous la responsabilité du Chef de Chantier.</w:t>
+        <w:t>Les livraisons de matériaux sont séquencées semaine par semaine selon l'avancement du chantier et directement orientées depuis nos quatre dépôts (cf. § 3.6) vers le chantier, sans transit prolongé dans les circulations communes de l'établissement — organisation placée sous la responsabilité du Chef de Chantier.</w:t>
       </w:r>
     </w:p>
+    <w:tbl>
+      <w:tblPr>
+        <w:tblStyle w:val="TableGrid"/>
+        <w:tblW w:type="auto" w:w="0"/>
+        <w:jc w:val="center"/>
+        <w:tblLook w:firstColumn="1" w:firstRow="1" w:lastColumn="0" w:lastRow="0" w:noHBand="0" w:noVBand="1" w:val="04A0"/>
+      </w:tblPr>
+      <w:tblGrid>
+        <w:gridCol w:w="5100"/>
+        <w:gridCol w:w="5100"/>
+      </w:tblGrid>
+      <w:tr>
+        <w:tc>
+          <w:tcPr>
+            <w:tcW w:type="dxa" w:w="3402"/>
+            <w:shd w:val="clear" w:color="auto" w:fill="2E74B5"/>
+          </w:tcPr>
+          <w:p>
+            <w:r/>
+            <w:r>
+              <w:rPr>
+                <w:b/>
+                <w:color w:val="FFFFFF"/>
+                <w:sz w:val="18"/>
+              </w:rPr>
+              <w:t>Moyen</w:t>
+            </w:r>
+          </w:p>
+        </w:tc>
+        <w:tc>
+          <w:tcPr>
+            <w:tcW w:type="dxa" w:w="5102"/>
+            <w:shd w:val="clear" w:color="auto" w:fill="2E74B5"/>
+          </w:tcPr>
+          <w:p>
+            <w:r/>
+            <w:r>
+              <w:rPr>
+                <w:b/>
+                <w:color w:val="FFFFFF"/>
+                <w:sz w:val="18"/>
+              </w:rPr>
+              <w:t>Usage</w:t>
+            </w:r>
+          </w:p>
+        </w:tc>
+      </w:tr>
+      <w:tr>
+        <w:tc>
+          <w:tcPr>
+            <w:tcW w:type="dxa" w:w="3402"/>
+          </w:tcPr>
+          <w:p>
+            <w:r/>
+            <w:r>
+              <w:rPr>
+                <w:sz w:val="18"/>
+              </w:rPr>
+              <w:t>Véhicules utilitaires légers (fourgons)</w:t>
+            </w:r>
+          </w:p>
+        </w:tc>
+        <w:tc>
+          <w:tcPr>
+            <w:tcW w:type="dxa" w:w="5102"/>
+          </w:tcPr>
+          <w:p>
+            <w:r/>
+            <w:r>
+              <w:rPr>
+                <w:sz w:val="18"/>
+              </w:rPr>
+              <w:t>Navettes régulières entre les dépôts (Livry-Gargan, La Houssaye-en-Brie, Saint-Ouen, Paris) et le chantier</w:t>
+            </w:r>
+          </w:p>
+        </w:tc>
+      </w:tr>
+      <w:tr>
+        <w:tc>
+          <w:tcPr>
+            <w:tcW w:type="dxa" w:w="3402"/>
+          </w:tcPr>
+          <w:p>
+            <w:r/>
+            <w:r>
+              <w:rPr>
+                <w:sz w:val="18"/>
+              </w:rPr>
+              <w:t>Diables et chariots à sangle</w:t>
+            </w:r>
+          </w:p>
+        </w:tc>
+        <w:tc>
+          <w:tcPr>
+            <w:tcW w:type="dxa" w:w="5102"/>
+          </w:tcPr>
+          <w:p>
+            <w:r/>
+            <w:r>
+              <w:rPr>
+                <w:sz w:val="18"/>
+              </w:rPr>
+              <w:t>Manutention verticale et sur seuils des dalles de faux plafonds et cartons de produits</w:t>
+            </w:r>
+          </w:p>
+        </w:tc>
+      </w:tr>
+      <w:tr>
+        <w:tc>
+          <w:tcPr>
+            <w:tcW w:type="dxa" w:w="3402"/>
+          </w:tcPr>
+          <w:p>
+            <w:r/>
+            <w:r>
+              <w:rPr>
+                <w:sz w:val="18"/>
+              </w:rPr>
+              <w:t>Transpalettes manuels</w:t>
+            </w:r>
+          </w:p>
+        </w:tc>
+        <w:tc>
+          <w:tcPr>
+            <w:tcW w:type="dxa" w:w="5102"/>
+          </w:tcPr>
+          <w:p>
+            <w:r/>
+            <w:r>
+              <w:rPr>
+                <w:sz w:val="18"/>
+              </w:rPr>
+              <w:t>Déplacement des palettes de matériaux (enduits, colles, ragréages) depuis le point de livraison</w:t>
+            </w:r>
+          </w:p>
+        </w:tc>
+      </w:tr>
+      <w:tr>
+        <w:tc>
+          <w:tcPr>
+            <w:tcW w:type="dxa" w:w="3402"/>
+          </w:tcPr>
+          <w:p>
+            <w:r/>
+            <w:r>
+              <w:rPr>
+                <w:sz w:val="18"/>
+              </w:rPr>
+              <w:t>Sangles d'arrimage et housses de transport</w:t>
+            </w:r>
+          </w:p>
+        </w:tc>
+        <w:tc>
+          <w:tcPr>
+            <w:tcW w:type="dxa" w:w="5102"/>
+          </w:tcPr>
+          <w:p>
+            <w:r/>
+            <w:r>
+              <w:rPr>
+                <w:sz w:val="18"/>
+              </w:rPr>
+              <w:t>Sécurisation des charges pendant le transport (rouleaux de sols, dalles fragiles)</w:t>
+            </w:r>
+          </w:p>
+        </w:tc>
+      </w:tr>
+      <w:tr>
+        <w:tc>
+          <w:tcPr>
+            <w:tcW w:type="dxa" w:w="3402"/>
+          </w:tcPr>
+          <w:p>
+            <w:r/>
+            <w:r>
+              <w:rPr>
+                <w:sz w:val="18"/>
+              </w:rPr>
+              <w:t>Rampes d'accès mobiles</w:t>
+            </w:r>
+          </w:p>
+        </w:tc>
+        <w:tc>
+          <w:tcPr>
+            <w:tcW w:type="dxa" w:w="5102"/>
+          </w:tcPr>
+          <w:p>
+            <w:r/>
+            <w:r>
+              <w:rPr>
+                <w:sz w:val="18"/>
+              </w:rPr>
+              <w:t>Franchissement des seuils et différences de niveau lors des déchargements</w:t>
+            </w:r>
+          </w:p>
+        </w:tc>
+      </w:tr>
+      <w:tr>
+        <w:tc>
+          <w:tcPr>
+            <w:tcW w:type="dxa" w:w="3402"/>
+          </w:tcPr>
+          <w:p>
+            <w:r/>
+            <w:r>
+              <w:rPr>
+                <w:sz w:val="18"/>
+              </w:rPr>
+              <w:t>Housses et protections pour rouleaux de sols souples</w:t>
+            </w:r>
+          </w:p>
+        </w:tc>
+        <w:tc>
+          <w:tcPr>
+            <w:tcW w:type="dxa" w:w="5102"/>
+          </w:tcPr>
+          <w:p>
+            <w:r/>
+            <w:r>
+              <w:rPr>
+                <w:sz w:val="18"/>
+              </w:rPr>
+              <w:t>Préservation des revêtements contre les chocs et l'humidité pendant le transport</w:t>
+            </w:r>
+          </w:p>
+        </w:tc>
+      </w:tr>
+      <w:tr>
+        <w:tc>
+          <w:tcPr>
+            <w:tcW w:type="dxa" w:w="3402"/>
+          </w:tcPr>
+          <w:p>
+            <w:r/>
+            <w:r>
+              <w:rPr>
+                <w:sz w:val="18"/>
+              </w:rPr>
+              <w:t>Radios / talkies-walkies</w:t>
+            </w:r>
+          </w:p>
+        </w:tc>
+        <w:tc>
+          <w:tcPr>
+            <w:tcW w:type="dxa" w:w="5102"/>
+          </w:tcPr>
+          <w:p>
+            <w:r/>
+            <w:r>
+              <w:rPr>
+                <w:sz w:val="18"/>
+              </w:rPr>
+              <w:t>Coordination entre le livreur, le magasinier et le Chef de Chantier lors des livraisons</w:t>
+            </w:r>
+          </w:p>
+        </w:tc>
+      </w:tr>
+    </w:tbl>
+    <w:p/>
     <w:p>
       <w:pPr>
         <w:pStyle w:val="ListBullet"/>
       </w:pPr>
       <w:r>
-        <w:t>Véhicules utilitaires dédiés aux livraisons et à l'approvisionnement des locaux de stockage.</w:t>
-      </w:r>
-    </w:p>
-    <w:p>
-      <w:pPr>
-        <w:pStyle w:val="ListBullet"/>
-      </w:pPr>
-      <w:r>
-        <w:t>Diables, chariots et transpalettes manuels adaptés à la manutention des dalles de faux plafonds et des rouleaux de sols souples.</w:t>
-      </w:r>
-    </w:p>
-    <w:p>
-      <w:pPr>
-        <w:pStyle w:val="ListBullet"/>
-      </w:pPr>
-      <w:r>
-        <w:t>Protection systématique des sols et circulations empruntés lors des opérations de manutention.</w:t>
+        <w:t>Protection systématique des sols et circulations empruntés lors des opérations de manutention (films et panneaux rigides, cf. § 3.10).</w:t>
       </w:r>
     </w:p>
     <w:p>
@@ -3819,6 +5548,14 @@
       </w:pPr>
       <w:r>
         <w:t>Coordination des créneaux de livraison avec la loge de sécurité de l'hôpital, en dehors des heures de forte affluence.</w:t>
+      </w:r>
+    </w:p>
+    <w:p>
+      <w:pPr>
+        <w:pStyle w:val="ListBullet"/>
+      </w:pPr>
+      <w:r>
+        <w:t>Approvisionnement séquencé au plus près du besoin de chaque phase, afin de limiter le stockage tampon sur site au strict nécessaire (cf. container/algeco de chantier, § 3.6).</w:t>
       </w:r>
     </w:p>
     <w:p>

</xml_diff>